<commit_message>
Zhao preprint resolution (6-agent re-verification 2026-08-16): PREPRINT_ONLY re-confirmed across ~30 sources incl. FOCS/STOC/QIP/TQC/CCC 2026 accepted lists; reduce zhao2026 in-text citations 8->6 (anaphora + cross-ref, no attribution site removed); add Kallaugher-Parekh-Voronova STOC 2024 (10.1145/3618260.3649709, Crossref-verified) as published anchor in Related Work and disclosure footnote; fix Related-Work misattribution (FOCS 2021 advantage is polynomial; first exponential natural-problem separation = STOC 2024); bibliography 55 entries, 55<->55 bijection; editor letter reports re-verification and the three changes; PREPRINT_AUDIT re-verification addendum; all deliverables rebuilt
</commit_message>
<xml_diff>
--- a/paper/mdpi_sensors/revision/response_to_editor.docx
+++ b/paper/mdpi_sensors/revision/response_to_editor.docx
@@ -190,7 +190,7 @@
               <w:pStyle w:val="Compact"/>
             </w:pPr>
             <w:r>
-              <w:t xml:space="preserve">References in the bibliography</w:t>
+              <w:t xml:space="preserve">References audited</w:t>
             </w:r>
           </w:p>
         </w:tc>
@@ -471,7 +471,72 @@
         <w:pStyle w:val="BodyText"/>
       </w:pPr>
       <w:r>
-        <w:t xml:space="preserve">We confirmed that no peer-reviewed version exists to substitute: the arXiv record carries no journal reference, the authors’ own institutional listing still describes the work as a preprint, and a Crossref registry query on the exact title returns no publisher DOI.</w:t>
+        <w:t xml:space="preserve">We confirmed — and, in preparing this reply, re-confirmed — that no peer-reviewed version exists to substitute. As of 16 August 2026: the arXiv record remains at version 1 with no journal reference and no related DOI; Crossref, Semantic Scholar, dblp, INSPIRE-HEP, Google Scholar, and OpenReview all record the work as arXiv-only; it appears in none of the accepted-papers lists of FOCS 2026, STOC 2026, QIP 2026, TQC 2026, CCC 2026, or SODA 2026, and on no publisher page of</w:t>
+      </w:r>
+      <w:r>
+        <w:t xml:space="preserve"> </w:t>
+      </w:r>
+      <w:r>
+        <w:rPr>
+          <w:i/>
+          <w:iCs/>
+        </w:rPr>
+        <w:t xml:space="preserve">Quantum</w:t>
+      </w:r>
+      <w:r>
+        <w:t xml:space="preserve">,</w:t>
+      </w:r>
+      <w:r>
+        <w:t xml:space="preserve"> </w:t>
+      </w:r>
+      <w:r>
+        <w:rPr>
+          <w:i/>
+          <w:iCs/>
+        </w:rPr>
+        <w:t xml:space="preserve">PRX Quantum</w:t>
+      </w:r>
+      <w:r>
+        <w:t xml:space="preserve">,</w:t>
+      </w:r>
+      <w:r>
+        <w:t xml:space="preserve"> </w:t>
+      </w:r>
+      <w:r>
+        <w:rPr>
+          <w:i/>
+          <w:iCs/>
+        </w:rPr>
+        <w:t xml:space="preserve">npj Quantum Information</w:t>
+      </w:r>
+      <w:r>
+        <w:t xml:space="preserve">,</w:t>
+      </w:r>
+      <w:r>
+        <w:t xml:space="preserve"> </w:t>
+      </w:r>
+      <w:r>
+        <w:rPr>
+          <w:i/>
+          <w:iCs/>
+        </w:rPr>
+        <w:t xml:space="preserve">Nature</w:t>
+      </w:r>
+      <w:r>
+        <w:t xml:space="preserve">, or</w:t>
+      </w:r>
+      <w:r>
+        <w:t xml:space="preserve"> </w:t>
+      </w:r>
+      <w:r>
+        <w:rPr>
+          <w:i/>
+          <w:iCs/>
+        </w:rPr>
+        <w:t xml:space="preserve">Science</w:t>
+      </w:r>
+      <w:r>
+        <w:t xml:space="preserve">; the publication pages of all seven authors list it as arXiv-only; and none of the works citing it records a venue or an in-press status for it.</w:t>
       </w:r>
     </w:p>
     <w:p>
@@ -716,13 +781,13 @@
       </w:r>
     </w:p>
     <w:bookmarkEnd w:id="11"/>
-    <w:bookmarkStart w:id="12" w:name="Xffe6706bbd5b7f7f4f64017495601c75927f736"/>
+    <w:bookmarkStart w:id="12" w:name="X08609b4fe521390e5231a0367c559615090aab6"/>
     <w:p>
       <w:pPr>
         <w:pStyle w:val="Heading2"/>
       </w:pPr>
       <w:r>
-        <w:t xml:space="preserve">4. What we have added in response to this comment</w:t>
+        <w:t xml:space="preserve">4. What we have changed in response to this comment</w:t>
       </w:r>
     </w:p>
     <w:p>
@@ -730,7 +795,122 @@
         <w:pStyle w:val="FirstParagraph"/>
       </w:pPr>
       <w:r>
-        <w:t xml:space="preserve">At the first citation of the preprint in the Introduction we have added a footnote making its status explicit to every reader:</w:t>
+        <w:t xml:space="preserve">Beyond the audit, we have reduced the manuscript’s reliance on the preprint to the minimum that honest attribution permits, and strengthened the published anchors around it:</w:t>
+      </w:r>
+    </w:p>
+    <w:p>
+      <w:pPr>
+        <w:pStyle w:val="Compact"/>
+        <w:numPr>
+          <w:ilvl w:val="0"/>
+          <w:numId w:val="1002"/>
+        </w:numPr>
+      </w:pPr>
+      <w:r>
+        <w:rPr>
+          <w:b/>
+          <w:bCs/>
+        </w:rPr>
+        <w:t xml:space="preserve">Citation reduction (eight occurrences → six).</w:t>
+      </w:r>
+      <w:r>
+        <w:t xml:space="preserve"> </w:t>
+      </w:r>
+      <w:r>
+        <w:t xml:space="preserve">Two repeat citations carried no independent attribution and were consolidated: a second citation within the same paragraph of Section 3.3 now reads</w:t>
+      </w:r>
+      <w:r>
+        <w:t xml:space="preserve"> </w:t>
+      </w:r>
+      <w:r>
+        <w:t xml:space="preserve">“the originating framework”</w:t>
+      </w:r>
+      <w:r>
+        <w:t xml:space="preserve">, and the quantum-memory bullet in Section 5.3 now points to Section 3.3, where the provenance is established. The preprint is now cited only where attributing its specific results requires it.</w:t>
+      </w:r>
+    </w:p>
+    <w:p>
+      <w:pPr>
+        <w:pStyle w:val="Compact"/>
+        <w:numPr>
+          <w:ilvl w:val="0"/>
+          <w:numId w:val="1002"/>
+        </w:numPr>
+      </w:pPr>
+      <w:r>
+        <w:rPr>
+          <w:b/>
+          <w:bCs/>
+        </w:rPr>
+        <w:t xml:space="preserve">A stronger published anchor added.</w:t>
+      </w:r>
+      <w:r>
+        <w:t xml:space="preserve"> </w:t>
+      </w:r>
+      <w:r>
+        <w:t xml:space="preserve">We added Kallaugher, Parekh and Voronova,</w:t>
+      </w:r>
+      <w:r>
+        <w:t xml:space="preserve"> </w:t>
+      </w:r>
+      <w:r>
+        <w:rPr>
+          <w:i/>
+          <w:iCs/>
+        </w:rPr>
+        <w:t xml:space="preserve">Exponential quantum space advantage for approximating maximum directed cut in the streaming model</w:t>
+      </w:r>
+      <w:r>
+        <w:t xml:space="preserve"> </w:t>
+      </w:r>
+      <w:r>
+        <w:t xml:space="preserve">(Proceedings of the 56th Annual ACM Symposium on Theory of Computing, STOC 2024, pp. 1805–1815, DOI 10.1145/3618260.3649709) — the first exponential quantum–classical space separation for a natural streaming problem, and the strongest peer-reviewed result of the kind the preprint extends. It is co-cited in the Related Work and in the disclosure footnote (bibliography now 55 entries; citation–bibliography consistency re-verified).</w:t>
+      </w:r>
+    </w:p>
+    <w:p>
+      <w:pPr>
+        <w:pStyle w:val="Compact"/>
+        <w:numPr>
+          <w:ilvl w:val="0"/>
+          <w:numId w:val="1002"/>
+        </w:numPr>
+      </w:pPr>
+      <w:r>
+        <w:rPr>
+          <w:b/>
+          <w:bCs/>
+        </w:rPr>
+        <w:t xml:space="preserve">A corrected attribution.</w:t>
+      </w:r>
+      <w:r>
+        <w:t xml:space="preserve"> </w:t>
+      </w:r>
+      <w:r>
+        <w:t xml:space="preserve">In verifying the anchors we found that our Related Work sentence credited Kallaugher’s 2021 FOCS paper with the</w:t>
+      </w:r>
+      <w:r>
+        <w:t xml:space="preserve"> </w:t>
+      </w:r>
+      <w:r>
+        <w:rPr>
+          <w:i/>
+          <w:iCs/>
+        </w:rPr>
+        <w:t xml:space="preserve">first exponential</w:t>
+      </w:r>
+      <w:r>
+        <w:t xml:space="preserve"> </w:t>
+      </w:r>
+      <w:r>
+        <w:t xml:space="preserve">separation; that paper’s advantage is polynomial (the exponential result for a natural streaming problem is the STOC 2024 paper above). The sentence now attributes each result correctly — a further accuracy improvement prompted directly by the Editor’s comment.</w:t>
+      </w:r>
+    </w:p>
+    <w:p>
+      <w:pPr>
+        <w:pStyle w:val="FirstParagraph"/>
+      </w:pPr>
+      <w:r>
+        <w:t xml:space="preserve">At the first citation of the preprint in the Introduction we have also added a footnote making its status explicit to every reader:</w:t>
       </w:r>
     </w:p>
     <w:p>
@@ -1008,6 +1188,36 @@
     <w:abstractNumId w:val="990"/>
   </w:num>
   <w:num w:numId="1001">
+    <w:abstractNumId w:val="99411"/>
+    <w:lvlOverride w:ilvl="0">
+      <w:startOverride w:val="1"/>
+    </w:lvlOverride>
+    <w:lvlOverride w:ilvl="1">
+      <w:startOverride w:val="1"/>
+    </w:lvlOverride>
+    <w:lvlOverride w:ilvl="2">
+      <w:startOverride w:val="1"/>
+    </w:lvlOverride>
+    <w:lvlOverride w:ilvl="3">
+      <w:startOverride w:val="1"/>
+    </w:lvlOverride>
+    <w:lvlOverride w:ilvl="4">
+      <w:startOverride w:val="1"/>
+    </w:lvlOverride>
+    <w:lvlOverride w:ilvl="5">
+      <w:startOverride w:val="1"/>
+    </w:lvlOverride>
+    <w:lvlOverride w:ilvl="6">
+      <w:startOverride w:val="1"/>
+    </w:lvlOverride>
+    <w:lvlOverride w:ilvl="7">
+      <w:startOverride w:val="1"/>
+    </w:lvlOverride>
+    <w:lvlOverride w:ilvl="8">
+      <w:startOverride w:val="1"/>
+    </w:lvlOverride>
+  </w:num>
+  <w:num w:numId="1002">
     <w:abstractNumId w:val="99411"/>
     <w:lvlOverride w:ilvl="0">
       <w:startOverride w:val="1"/>

</xml_diff>

<commit_message>
Editor response rewritten as one coherent letter: audit + 16-Aug re-verification + irreplaceability + three manuscript changes + five safeguards + commitment; expanded outcome table; all formats and packages rebuilt
</commit_message>
<xml_diff>
--- a/paper/mdpi_sensors/revision/response_to_editor.docx
+++ b/paper/mdpi_sensors/revision/response_to_editor.docx
@@ -109,32 +109,16 @@
         <w:t xml:space="preserve"> </w:t>
       </w:r>
       <w:r>
-        <w:t xml:space="preserve">We thank the Academic Editor for this instruction. We agree with the principle behind it and have acted on it: the entire reference list was audited entry by entry, every preprint that has since been published has been replaced by its peer-reviewed version, and the reference list now contains</w:t>
-      </w:r>
-      <w:r>
-        <w:t xml:space="preserve"> </w:t>
-      </w:r>
-      <w:r>
-        <w:rPr>
-          <w:b/>
-          <w:bCs/>
-        </w:rPr>
-        <w:t xml:space="preserve">one</w:t>
-      </w:r>
-      <w:r>
-        <w:t xml:space="preserve"> </w:t>
-      </w:r>
-      <w:r>
-        <w:t xml:space="preserve">preprint, which is the specific framework whose robustness this paper studies. Below we report what the audit found, explain why that single entry cannot be substituted without misattributing its results, and describe the safeguards — including a new footnote added in response to this comment — that ensure no conclusion of this paper depends on it.</w:t>
-      </w:r>
-    </w:p>
-    <w:bookmarkStart w:id="9" w:name="what-the-audit-found"/>
+        <w:t xml:space="preserve">We thank the Academic Editor for this instruction and agree with the principle behind it. We acted on it in three steps. First, we audited every reference and replaced every preprint for which a published version exists. Second, immediately before submitting this revision, we re-verified that the single remaining preprint still has no published version anywhere. Third, we reduced the manuscript’s reliance on that one entry to the minimum that honest attribution permits, and strengthened the peer-reviewed anchors around it. The result: of the 55 references in the revised manuscript, exactly one is a preprint — the specific framework this paper studies — explicitly labelled as such, cited only where attributing its results requires it, and load-bearing for none of the paper’s conclusions.</w:t>
+      </w:r>
+    </w:p>
+    <w:bookmarkStart w:id="9" w:name="audit-and-re-verification"/>
     <w:p>
       <w:pPr>
         <w:pStyle w:val="Heading2"/>
       </w:pPr>
       <w:r>
-        <w:t xml:space="preserve">1. What the audit found</w:t>
+        <w:t xml:space="preserve">1. Audit and re-verification</w:t>
       </w:r>
     </w:p>
     <w:p>
@@ -142,13 +126,14 @@
         <w:pStyle w:val="FirstParagraph"/>
       </w:pPr>
       <w:r>
-        <w:t xml:space="preserve">Every one of the 54 references was classified by publication type (journal article, conference paper, preprint, report, thesis, book, website) and then verified at the metadata level: all 51 entries carrying a DOI were resolved through doi.org content negotiation and machine-compared against the cited title, first author, venue, and year; the three entries without a DOI were checked against their publisher’s own record.</w:t>
+        <w:t xml:space="preserve">Every one of the 54 references in the reviewed manuscript was classified by publication type (journal article, conference paper, monograph, book, preprint) and verified at the metadata level: all 51 entries carrying a DOI were resolved through doi.org content negotiation and machine-compared against the cited title, first author, venue, and year; the three entries without a DOI were checked against their publisher’s own record.</w:t>
       </w:r>
     </w:p>
     <w:tbl>
       <w:tblPr>
         <w:tblStyle w:val="Table"/>
-        <w:tblW w:type="auto" w:w="0"/>
+        <w:tblW w:type="pct" w:w="5000"/>
+        <w:tblLayout w:type="fixed"/>
         <w:tblLook w:firstRow="1" w:lastRow="0" w:firstColumn="0" w:lastColumn="0" w:noHBand="0" w:noVBand="0" w:val="0020"/>
       </w:tblPr>
       <w:tblGrid>
@@ -177,7 +162,7 @@
               <w:pStyle w:val="Compact"/>
             </w:pPr>
             <w:r>
-              <w:t xml:space="preserve">Count</w:t>
+              <w:t xml:space="preserve">Result</w:t>
             </w:r>
           </w:p>
         </w:tc>
@@ -214,7 +199,7 @@
               <w:pStyle w:val="Compact"/>
             </w:pPr>
             <w:r>
-              <w:t xml:space="preserve">Preprints present before the audit</w:t>
+              <w:t xml:space="preserve">Preprints found</w:t>
             </w:r>
           </w:p>
         </w:tc>
@@ -238,11 +223,7 @@
               <w:pStyle w:val="Compact"/>
             </w:pPr>
             <w:r>
-              <w:rPr>
-                <w:b/>
-                <w:bCs/>
-              </w:rPr>
-              <w:t xml:space="preserve">Preprints replaced with the published version</w:t>
+              <w:t xml:space="preserve">Replaced with the published version</w:t>
             </w:r>
           </w:p>
         </w:tc>
@@ -253,10 +234,6 @@
               <w:pStyle w:val="Compact"/>
             </w:pPr>
             <w:r>
-              <w:rPr>
-                <w:b/>
-                <w:bCs/>
-              </w:rPr>
               <w:t xml:space="preserve">1</w:t>
             </w:r>
           </w:p>
@@ -270,7 +247,7 @@
               <w:pStyle w:val="Compact"/>
             </w:pPr>
             <w:r>
-              <w:t xml:space="preserve">Preprints remaining (no published version exists)</w:t>
+              <w:t xml:space="preserve">Remaining preprints — no published version exists (re-verified 16 Aug 2026)</w:t>
             </w:r>
           </w:p>
         </w:tc>
@@ -334,6 +311,94 @@
           </w:p>
         </w:tc>
       </w:tr>
+      <w:tr>
+        <w:tc>
+          <w:tcPr/>
+          <w:p>
+            <w:pPr>
+              <w:pStyle w:val="Compact"/>
+            </w:pPr>
+            <w:r>
+              <w:t xml:space="preserve">In-text citations of the remaining preprint</w:t>
+            </w:r>
+          </w:p>
+        </w:tc>
+        <w:tc>
+          <w:tcPr/>
+          <w:p>
+            <w:pPr>
+              <w:pStyle w:val="Compact"/>
+            </w:pPr>
+            <w:r>
+              <w:t xml:space="preserve">reduced 8 → 6</w:t>
+            </w:r>
+          </w:p>
+        </w:tc>
+      </w:tr>
+      <w:tr>
+        <w:tc>
+          <w:tcPr/>
+          <w:p>
+            <w:pPr>
+              <w:pStyle w:val="Compact"/>
+            </w:pPr>
+            <w:r>
+              <w:t xml:space="preserve">Published anchors now co-cited with it</w:t>
+            </w:r>
+          </w:p>
+        </w:tc>
+        <w:tc>
+          <w:tcPr/>
+          <w:p>
+            <w:pPr>
+              <w:pStyle w:val="Compact"/>
+            </w:pPr>
+            <w:r>
+              <w:t xml:space="preserve">FOCS 2021 · STOC 2024 · SOSA 2025 ·</w:t>
+            </w:r>
+            <w:r>
+              <w:t xml:space="preserve"> </w:t>
+            </w:r>
+            <w:r>
+              <w:rPr>
+                <w:i/>
+                <w:iCs/>
+              </w:rPr>
+              <w:t xml:space="preserve">Science</w:t>
+            </w:r>
+            <w:r>
+              <w:t xml:space="preserve"> </w:t>
+            </w:r>
+            <w:r>
+              <w:t xml:space="preserve">2022</w:t>
+            </w:r>
+          </w:p>
+        </w:tc>
+      </w:tr>
+      <w:tr>
+        <w:tc>
+          <w:tcPr/>
+          <w:p>
+            <w:pPr>
+              <w:pStyle w:val="Compact"/>
+            </w:pPr>
+            <w:r>
+              <w:t xml:space="preserve">Bibliography after this revision</w:t>
+            </w:r>
+          </w:p>
+        </w:tc>
+        <w:tc>
+          <w:tcPr/>
+          <w:p>
+            <w:pPr>
+              <w:pStyle w:val="Compact"/>
+            </w:pPr>
+            <w:r>
+              <w:t xml:space="preserve">55 entries · citation–bibliography consistency 55 ↔ 55</w:t>
+            </w:r>
+          </w:p>
+        </w:tc>
+      </w:tr>
     </w:tbl>
     <w:p>
       <w:pPr>
@@ -363,7 +428,7 @@
         <w:t xml:space="preserve">How to design a quantum streaming algorithm without knowing anything about quantum computing</w:t>
       </w:r>
       <w:r>
-        <w:t xml:space="preserve">, previously cited as an arXiv preprint, has since appeared in the</w:t>
+        <w:t xml:space="preserve">, previously cited via its arXiv posting, now carries its published version in the</w:t>
       </w:r>
       <w:r>
         <w:t xml:space="preserve"> </w:t>
@@ -376,7 +441,7 @@
         <w:t xml:space="preserve">Proceedings of the 2025 Symposium on Simplicity in Algorithms (SOSA)</w:t>
       </w:r>
       <w:r>
-        <w:t xml:space="preserve">, pp. 9–45. The entry now carries the publisher DOI 10.1137/1.9781611978315.2, and the author order was confirmed against the publisher’s article page and the proceedings table of contents.</w:t>
+        <w:t xml:space="preserve">, pp. 9–45, publisher DOI 10.1137/1.9781611978315.2, with the byline order confirmed against the publisher’s article page and table of contents.</w:t>
       </w:r>
     </w:p>
     <w:p>
@@ -394,7 +459,7 @@
         <w:t xml:space="preserve"> </w:t>
       </w:r>
       <w:r>
-        <w:t xml:space="preserve">The audit also caught an unrelated defect that would otherwise have reached print: the entry for Su, Guo and Wang (2024) carried a transposed article number whose DOI resolved to a different paper. It now reads</w:t>
+        <w:t xml:space="preserve">The audit also caught a defect unrelated to preprints that would otherwise have reached print: the entry for Su, Guo and Wang (2024) carried a transposed article number whose DOI resolved to a different paper. It now reads</w:t>
       </w:r>
       <w:r>
         <w:t xml:space="preserve"> </w:t>
@@ -420,22 +485,22 @@
         <w:t xml:space="preserve">, article 120799, DOI 10.1016/j.ins.2024.120799, verified against the publisher’s record.</w:t>
       </w:r>
     </w:p>
-    <w:bookmarkEnd w:id="9"/>
-    <w:bookmarkStart w:id="10" w:name="the-one-preprint-that-remains"/>
-    <w:p>
-      <w:pPr>
-        <w:pStyle w:val="Heading2"/>
-      </w:pPr>
-      <w:r>
-        <w:t xml:space="preserve">2. The one preprint that remains</w:t>
-      </w:r>
-    </w:p>
-    <w:p>
-      <w:pPr>
-        <w:pStyle w:val="FirstParagraph"/>
-      </w:pPr>
-      <w:r>
-        <w:t xml:space="preserve">The remaining entry is Zhao et al.,</w:t>
+    <w:p>
+      <w:pPr>
+        <w:pStyle w:val="BodyText"/>
+      </w:pPr>
+      <w:r>
+        <w:rPr>
+          <w:b/>
+          <w:bCs/>
+        </w:rPr>
+        <w:t xml:space="preserve">Re-verified.</w:t>
+      </w:r>
+      <w:r>
+        <w:t xml:space="preserve"> </w:t>
+      </w:r>
+      <w:r>
+        <w:t xml:space="preserve">On 16 August 2026 we checked again, specifically for this reply, whether the remaining preprint has been published or accepted anywhere. As of that date: its arXiv record remains at version 1 with no journal reference and no related DOI; Crossref, Semantic Scholar, dblp, INSPIRE-HEP, Google Scholar, and OpenReview all record the work as arXiv-only; it appears in none of the accepted-papers lists of FOCS 2026, STOC 2026, QIP 2026, TQC 2026, CCC 2026, or SODA 2026, and on no publisher page of</w:t>
       </w:r>
       <w:r>
         <w:t xml:space="preserve"> </w:t>
@@ -445,33 +510,10 @@
           <w:i/>
           <w:iCs/>
         </w:rPr>
-        <w:t xml:space="preserve">Exponential quantum advantage in processing massive classical data</w:t>
-      </w:r>
-      <w:r>
-        <w:t xml:space="preserve"> </w:t>
-      </w:r>
-      <w:r>
-        <w:t xml:space="preserve">(arXiv:2604.07639), labelled</w:t>
-      </w:r>
-      <w:r>
-        <w:t xml:space="preserve"> </w:t>
-      </w:r>
-      <w:r>
-        <w:t xml:space="preserve">“Preprint”</w:t>
-      </w:r>
-      <w:r>
-        <w:t xml:space="preserve"> </w:t>
-      </w:r>
-      <w:r>
-        <w:t xml:space="preserve">in the bibliography.</w:t>
-      </w:r>
-    </w:p>
-    <w:p>
-      <w:pPr>
-        <w:pStyle w:val="BodyText"/>
-      </w:pPr>
-      <w:r>
-        <w:t xml:space="preserve">We confirmed — and, in preparing this reply, re-confirmed — that no peer-reviewed version exists to substitute. As of 16 August 2026: the arXiv record remains at version 1 with no journal reference and no related DOI; Crossref, Semantic Scholar, dblp, INSPIRE-HEP, Google Scholar, and OpenReview all record the work as arXiv-only; it appears in none of the accepted-papers lists of FOCS 2026, STOC 2026, QIP 2026, TQC 2026, CCC 2026, or SODA 2026, and on no publisher page of</w:t>
+        <w:t xml:space="preserve">Quantum</w:t>
+      </w:r>
+      <w:r>
+        <w:t xml:space="preserve">,</w:t>
       </w:r>
       <w:r>
         <w:t xml:space="preserve"> </w:t>
@@ -481,7 +523,7 @@
           <w:i/>
           <w:iCs/>
         </w:rPr>
-        <w:t xml:space="preserve">Quantum</w:t>
+        <w:t xml:space="preserve">PRX Quantum</w:t>
       </w:r>
       <w:r>
         <w:t xml:space="preserve">,</w:t>
@@ -494,7 +536,7 @@
           <w:i/>
           <w:iCs/>
         </w:rPr>
-        <w:t xml:space="preserve">PRX Quantum</w:t>
+        <w:t xml:space="preserve">npj Quantum Information</w:t>
       </w:r>
       <w:r>
         <w:t xml:space="preserve">,</w:t>
@@ -507,10 +549,10 @@
           <w:i/>
           <w:iCs/>
         </w:rPr>
-        <w:t xml:space="preserve">npj Quantum Information</w:t>
-      </w:r>
-      <w:r>
-        <w:t xml:space="preserve">,</w:t>
+        <w:t xml:space="preserve">Nature</w:t>
+      </w:r>
+      <w:r>
+        <w:t xml:space="preserve">, or</w:t>
       </w:r>
       <w:r>
         <w:t xml:space="preserve"> </w:t>
@@ -520,10 +562,28 @@
           <w:i/>
           <w:iCs/>
         </w:rPr>
-        <w:t xml:space="preserve">Nature</w:t>
-      </w:r>
-      <w:r>
-        <w:t xml:space="preserve">, or</w:t>
+        <w:t xml:space="preserve">Science</w:t>
+      </w:r>
+      <w:r>
+        <w:t xml:space="preserve">; the publication pages of all seven of its authors list it as arXiv-only; and none of the works citing it records a venue or an in-press status for it.</w:t>
+      </w:r>
+    </w:p>
+    <w:bookmarkEnd w:id="9"/>
+    <w:bookmarkStart w:id="10" w:name="X6d2fb164b89a225981fce3f83b4e848cdbe03fd"/>
+    <w:p>
+      <w:pPr>
+        <w:pStyle w:val="Heading2"/>
+      </w:pPr>
+      <w:r>
+        <w:t xml:space="preserve">2. The one preprint that remains — and why substitution is not available</w:t>
+      </w:r>
+    </w:p>
+    <w:p>
+      <w:pPr>
+        <w:pStyle w:val="FirstParagraph"/>
+      </w:pPr>
+      <w:r>
+        <w:t xml:space="preserve">The remaining entry is Zhao et al.,</w:t>
       </w:r>
       <w:r>
         <w:t xml:space="preserve"> </w:t>
@@ -533,10 +593,25 @@
           <w:i/>
           <w:iCs/>
         </w:rPr>
-        <w:t xml:space="preserve">Science</w:t>
-      </w:r>
-      <w:r>
-        <w:t xml:space="preserve">; the publication pages of all seven authors list it as arXiv-only; and none of the works citing it records a venue or an in-press status for it.</w:t>
+        <w:t xml:space="preserve">Exponential quantum advantage in processing massive classical data</w:t>
+      </w:r>
+      <w:r>
+        <w:t xml:space="preserve"> </w:t>
+      </w:r>
+      <w:r>
+        <w:t xml:space="preserve">(arXiv:2604.07639), labelled</w:t>
+      </w:r>
+      <w:r>
+        <w:t xml:space="preserve"> </w:t>
+      </w:r>
+      <w:r>
+        <w:t xml:space="preserve">“Preprint”</w:t>
+      </w:r>
+      <w:r>
+        <w:t xml:space="preserve"> </w:t>
+      </w:r>
+      <w:r>
+        <w:t xml:space="preserve">in the bibliography.</w:t>
       </w:r>
     </w:p>
     <w:p>
@@ -544,7 +619,7 @@
         <w:pStyle w:val="BodyText"/>
       </w:pPr>
       <w:r>
-        <w:t xml:space="preserve">We respectfully submit that this entry is a different case from the one the Editor’s comment is aimed at. It is not cited as supporting evidence for a claim of ours, where a related published work could stand in its place.</w:t>
+        <w:t xml:space="preserve">We respectfully submit that this entry is a different case from the one the Editor’s instruction is aimed at. It is not cited as supporting evidence for a claim of ours, where a related published work could stand in its place.</w:t>
       </w:r>
       <w:r>
         <w:t xml:space="preserve"> </w:t>
@@ -560,25 +635,25 @@
         <w:t xml:space="preserve"> </w:t>
       </w:r>
       <w:r>
-        <w:t xml:space="preserve">This paper examines how the correlation assumptions of that specific framework — its refreshing time and repetition number, its ×R sample overhead, its task-specific classical hardness results — behave when the data stream is not IID. Substituting a related published work would attribute those particular theorems to authors who did not prove them, and removing the citation would leave the framework we analyse unattributed. Either course would introduce a citation-integrity problem more serious than the one the instruction is intended to prevent.</w:t>
+        <w:t xml:space="preserve">This paper examines how the correlation assumptions of that specific framework — its refreshing time and repetition number, its ×R sample-overhead theorem, its task-specific classical hardness results — behave when the data stream is not IID. Substituting a related published work would attribute those particular theorems to authors who did not prove them; removing the citation would leave the framework the paper analyses unattributed. Either course would introduce a citation-integrity problem more serious than the one the instruction is intended to prevent.</w:t>
+      </w:r>
+    </w:p>
+    <w:p>
+      <w:pPr>
+        <w:pStyle w:val="BodyText"/>
+      </w:pPr>
+      <w:r>
+        <w:t xml:space="preserve">We did examine the closest published works in this literature as potential substitutes — including peer-reviewed results on learning quantum observables from classical data, on the circuit cost of quantum access models, and on quantum streaming advantages. None of them contains the framework studied here; where they support adjacent general claims, the manuscript already lets published references carry those claims, as described next.</w:t>
       </w:r>
     </w:p>
     <w:bookmarkEnd w:id="10"/>
-    <w:bookmarkStart w:id="11" w:name="X896bf18d0d2d83c984ccdc3100a5239f91c9f4f"/>
+    <w:bookmarkStart w:id="11" w:name="what-we-changed-in-the-manuscript"/>
     <w:p>
       <w:pPr>
         <w:pStyle w:val="Heading2"/>
       </w:pPr>
       <w:r>
-        <w:t xml:space="preserve">3. Why no conclusion of this paper depends on it</w:t>
-      </w:r>
-    </w:p>
-    <w:p>
-      <w:pPr>
-        <w:pStyle w:val="FirstParagraph"/>
-      </w:pPr>
-      <w:r>
-        <w:t xml:space="preserve">The Editor’s concern is that a preprint’s content may change before publication. We would like to show concretely why that risk does not propagate into this paper’s findings:</w:t>
+        <w:t xml:space="preserve">3. What we changed in the manuscript</w:t>
       </w:r>
     </w:p>
     <w:p>
@@ -594,13 +669,22 @@
           <w:b/>
           <w:bCs/>
         </w:rPr>
-        <w:t xml:space="preserve">No quantum algorithm is implemented or simulated.</w:t>
-      </w:r>
-      <w:r>
-        <w:t xml:space="preserve"> </w:t>
-      </w:r>
-      <w:r>
-        <w:t xml:space="preserve">The manuscript states this verbatim in the Abstract, Section 3.3, four separate results subsections, the Threats to Validity section, and the Conclusions. Nothing in the paper executes, reproduces, or empirically confirms any result of the preprint.</w:t>
+        <w:t xml:space="preserve">In-text citations of the preprint reduced from eight to six.</w:t>
+      </w:r>
+      <w:r>
+        <w:t xml:space="preserve"> </w:t>
+      </w:r>
+      <w:r>
+        <w:t xml:space="preserve">Two repeat citations carried no independent attribution and were consolidated: a second citation within the same paragraph of Section 3.3 now reads</w:t>
+      </w:r>
+      <w:r>
+        <w:t xml:space="preserve"> </w:t>
+      </w:r>
+      <w:r>
+        <w:t xml:space="preserve">“the originating framework”</w:t>
+      </w:r>
+      <w:r>
+        <w:t xml:space="preserve">, and the quantum-memory bullet in Section 5.3 now points to Section 3.3, where the provenance is established. The preprint is now cited only at the sites where attributing its specific results requires it.</w:t>
       </w:r>
     </w:p>
     <w:p>
@@ -616,13 +700,13 @@
           <w:b/>
           <w:bCs/>
         </w:rPr>
-        <w:t xml:space="preserve">Every inherited quantity is tabulated with its provenance.</w:t>
-      </w:r>
-      <w:r>
-        <w:t xml:space="preserve"> </w:t>
-      </w:r>
-      <w:r>
-        <w:t xml:space="preserve">Table 1 (Section 3.3) lists, per quantity, what is inherited from the framework, what this paper introduces, and what is</w:t>
+        <w:t xml:space="preserve">A stronger published anchor added, and an attribution corrected.</w:t>
+      </w:r>
+      <w:r>
+        <w:t xml:space="preserve"> </w:t>
+      </w:r>
+      <w:r>
+        <w:t xml:space="preserve">We added Kallaugher, Parekh and Voronova,</w:t>
       </w:r>
       <w:r>
         <w:t xml:space="preserve"> </w:t>
@@ -632,13 +716,29 @@
           <w:i/>
           <w:iCs/>
         </w:rPr>
-        <w:t xml:space="preserve">not</w:t>
-      </w:r>
-      <w:r>
-        <w:t xml:space="preserve"> </w:t>
-      </w:r>
-      <w:r>
-        <w:t xml:space="preserve">theoretically guaranteed. If any theorem of the preprint changes, the affected rows are identifiable at a glance rather than diffused through the text.</w:t>
+        <w:t xml:space="preserve">Exponential quantum space advantage for approximating maximum directed cut in the streaming model</w:t>
+      </w:r>
+      <w:r>
+        <w:t xml:space="preserve"> </w:t>
+      </w:r>
+      <w:r>
+        <w:t xml:space="preserve">(Proceedings of the 56th Annual ACM Symposium on Theory of Computing, STOC 2024, pp. 1805–1815, DOI 10.1145/3618260.3649709) — the first exponential quantum–classical space separation for a natural streaming problem, and the strongest peer-reviewed result of the kind the preprint extends. It is co-cited in the Related Work and in the disclosure footnote. In verifying the anchors we also found that our Related Work sentence had credited Kallaugher’s 2021 FOCS paper with the</w:t>
+      </w:r>
+      <w:r>
+        <w:t xml:space="preserve"> </w:t>
+      </w:r>
+      <w:r>
+        <w:rPr>
+          <w:i/>
+          <w:iCs/>
+        </w:rPr>
+        <w:t xml:space="preserve">first exponential</w:t>
+      </w:r>
+      <w:r>
+        <w:t xml:space="preserve"> </w:t>
+      </w:r>
+      <w:r>
+        <w:t xml:space="preserve">separation, although that paper’s advantage is polynomial; the sentence now attributes each result correctly. The bibliography stands at 55 entries with the citation–bibliography consistency re-verified.</w:t>
       </w:r>
     </w:p>
     <w:p>
@@ -654,140 +754,31 @@
           <w:b/>
           <w:bCs/>
         </w:rPr>
-        <w:t xml:space="preserve">The paper’s own contribution is independent of it.</w:t>
-      </w:r>
-      <w:r>
-        <w:t xml:space="preserve"> </w:t>
-      </w:r>
-      <w:r>
-        <w:t xml:space="preserve">The (τ, r) sensitivity landscape, the classical streaming baselines, the correlation diagnostics, and the two real-telemetry case studies are classical measurements that stand on their own regardless of the preprint’s fate.</w:t>
-      </w:r>
-    </w:p>
-    <w:p>
-      <w:pPr>
-        <w:pStyle w:val="Compact"/>
-        <w:numPr>
-          <w:ilvl w:val="0"/>
-          <w:numId w:val="1001"/>
-        </w:numPr>
-      </w:pPr>
-      <w:r>
-        <w:rPr>
-          <w:b/>
-          <w:bCs/>
-        </w:rPr>
-        <w:t xml:space="preserve">The revision already removed any dependence on the framework’s claims being settled.</w:t>
-      </w:r>
-      <w:r>
-        <w:t xml:space="preserve"> </w:t>
-      </w:r>
-      <w:r>
-        <w:t xml:space="preserve">Following the reviewers’ recommendations, the manuscript was repositioned as a proxy-based diagnostic and hypothesis-generation framework; it treats the framework’s results as premises to be stress-tested, not as established facts to be relied upon, and states plainly that it</w:t>
-      </w:r>
-      <w:r>
-        <w:t xml:space="preserve"> </w:t>
-      </w:r>
-      <w:r>
-        <w:t xml:space="preserve">“demonstrates no quantum advantage and implements no quantum algorithm”</w:t>
-      </w:r>
-      <w:r>
-        <w:t xml:space="preserve">.</w:t>
-      </w:r>
-    </w:p>
-    <w:p>
-      <w:pPr>
-        <w:pStyle w:val="Compact"/>
-        <w:numPr>
-          <w:ilvl w:val="0"/>
-          <w:numId w:val="1001"/>
-        </w:numPr>
-      </w:pPr>
-      <w:r>
-        <w:rPr>
-          <w:b/>
-          <w:bCs/>
-        </w:rPr>
-        <w:t xml:space="preserve">Its theorems are never invoked alone.</w:t>
-      </w:r>
-      <w:r>
-        <w:t xml:space="preserve"> </w:t>
-      </w:r>
-      <w:r>
-        <w:t xml:space="preserve">Each invocation is accompanied by peer-reviewed anchors: Kallaugher,</w:t>
-      </w:r>
-      <w:r>
-        <w:t xml:space="preserve"> </w:t>
-      </w:r>
-      <w:r>
-        <w:rPr>
-          <w:i/>
-          <w:iCs/>
-        </w:rPr>
-        <w:t xml:space="preserve">A quantum advantage for a natural streaming problem</w:t>
-      </w:r>
-      <w:r>
-        <w:t xml:space="preserve"> </w:t>
-      </w:r>
-      <w:r>
-        <w:t xml:space="preserve">(IEEE FOCS 2021, pp. 897–908); Kallaugher, Parekh and Voronova (SOSA 2025, pp. 9–45); and Huang et al.,</w:t>
-      </w:r>
-      <w:r>
-        <w:t xml:space="preserve"> </w:t>
-      </w:r>
-      <w:r>
-        <w:rPr>
-          <w:i/>
-          <w:iCs/>
-        </w:rPr>
-        <w:t xml:space="preserve">Quantum advantage in learning from experiments</w:t>
-      </w:r>
-      <w:r>
-        <w:t xml:space="preserve"> </w:t>
-      </w:r>
-      <w:r>
-        <w:t xml:space="preserve">(</w:t>
-      </w:r>
-      <w:r>
-        <w:rPr>
-          <w:i/>
-          <w:iCs/>
-        </w:rPr>
-        <w:t xml:space="preserve">Science</w:t>
-      </w:r>
-      <w:r>
-        <w:t xml:space="preserve"> </w:t>
-      </w:r>
-      <w:r>
-        <w:rPr>
-          <w:b/>
-          <w:bCs/>
-        </w:rPr>
-        <w:t xml:space="preserve">376</w:t>
-      </w:r>
-      <w:r>
-        <w:t xml:space="preserve">, 1182–1186, 2022). These are precisely the</w:t>
-      </w:r>
-      <w:r>
-        <w:t xml:space="preserve"> </w:t>
-      </w:r>
-      <w:r>
-        <w:t xml:space="preserve">“related works already published”</w:t>
-      </w:r>
-      <w:r>
-        <w:t xml:space="preserve"> </w:t>
-      </w:r>
-      <w:r>
-        <w:t xml:space="preserve">the Editor suggests, and they now carry the general claims about quantum streaming separations wherever such claims are made.</w:t>
+        <w:t xml:space="preserve">An explicit status footnote at the first citation.</w:t>
+      </w:r>
+      <w:r>
+        <w:t xml:space="preserve"> </w:t>
+      </w:r>
+      <w:r>
+        <w:t xml:space="preserve">So that the preprint’s status is visible to every reader, the first citation in the Introduction now carries the following footnote:</w:t>
+      </w:r>
+    </w:p>
+    <w:p>
+      <w:pPr>
+        <w:pStyle w:val="BlockText"/>
+      </w:pPr>
+      <w:r>
+        <w:t xml:space="preserve">“This reference is a preprint (arXiv:2604.07639) and, at the time of writing, had not appeared in a peer-reviewed venue; it is labelled as such in the bibliography. It is cited because it is the specific framework whose robustness under correlated data this paper examines, so no already-published work can stand in for it without misattributing its results. No conclusion of this paper depends on its final published form: no quantum algorithm is implemented or simulated here, every quantity inherited from the framework is listed with its provenance and epistemic status in Table 1, and its theorems are invoked alongside peer-reviewed results on quantum streaming separations and on experimentally demonstrated quantum advantage.”</w:t>
       </w:r>
     </w:p>
     <w:bookmarkEnd w:id="11"/>
-    <w:bookmarkStart w:id="12" w:name="X08609b4fe521390e5231a0367c559615090aab6"/>
+    <w:bookmarkStart w:id="12" w:name="Xaead771fc1938dab1cd9eb8763e77f2731eecee"/>
     <w:p>
       <w:pPr>
         <w:pStyle w:val="Heading2"/>
       </w:pPr>
       <w:r>
-        <w:t xml:space="preserve">4. What we have changed in response to this comment</w:t>
+        <w:t xml:space="preserve">4. Why no conclusion of the paper depends on its final form</w:t>
       </w:r>
     </w:p>
     <w:p>
@@ -795,7 +786,7 @@
         <w:pStyle w:val="FirstParagraph"/>
       </w:pPr>
       <w:r>
-        <w:t xml:space="preserve">Beyond the audit, we have reduced the manuscript’s reliance on the preprint to the minimum that honest attribution permits, and strengthened the published anchors around it:</w:t>
+        <w:t xml:space="preserve">The Editor’s underlying concern is that a preprint’s content may change before publication. That risk does not propagate into this paper’s findings, for five reasons:</w:t>
       </w:r>
     </w:p>
     <w:p>
@@ -811,22 +802,13 @@
           <w:b/>
           <w:bCs/>
         </w:rPr>
-        <w:t xml:space="preserve">Citation reduction (eight occurrences → six).</w:t>
-      </w:r>
-      <w:r>
-        <w:t xml:space="preserve"> </w:t>
-      </w:r>
-      <w:r>
-        <w:t xml:space="preserve">Two repeat citations carried no independent attribution and were consolidated: a second citation within the same paragraph of Section 3.3 now reads</w:t>
-      </w:r>
-      <w:r>
-        <w:t xml:space="preserve"> </w:t>
-      </w:r>
-      <w:r>
-        <w:t xml:space="preserve">“the originating framework”</w:t>
-      </w:r>
-      <w:r>
-        <w:t xml:space="preserve">, and the quantum-memory bullet in Section 5.3 now points to Section 3.3, where the provenance is established. The preprint is now cited only where attributing its specific results requires it.</w:t>
+        <w:t xml:space="preserve">No quantum algorithm is implemented or simulated.</w:t>
+      </w:r>
+      <w:r>
+        <w:t xml:space="preserve"> </w:t>
+      </w:r>
+      <w:r>
+        <w:t xml:space="preserve">The manuscript states this verbatim in the Abstract, Section 3.3, four results subsections, the Threats to Validity section, and the Conclusions; nothing in the paper executes or empirically confirms any result of the preprint.</w:t>
       </w:r>
     </w:p>
     <w:p>
@@ -842,13 +824,13 @@
           <w:b/>
           <w:bCs/>
         </w:rPr>
-        <w:t xml:space="preserve">A stronger published anchor added.</w:t>
-      </w:r>
-      <w:r>
-        <w:t xml:space="preserve"> </w:t>
-      </w:r>
-      <w:r>
-        <w:t xml:space="preserve">We added Kallaugher, Parekh and Voronova,</w:t>
+        <w:t xml:space="preserve">Every inherited quantity is tabulated with its provenance.</w:t>
+      </w:r>
+      <w:r>
+        <w:t xml:space="preserve"> </w:t>
+      </w:r>
+      <w:r>
+        <w:t xml:space="preserve">Table 1 lists, per quantity, what is inherited from the framework, what this paper introduces, and what is</w:t>
       </w:r>
       <w:r>
         <w:t xml:space="preserve"> </w:t>
@@ -858,13 +840,13 @@
           <w:i/>
           <w:iCs/>
         </w:rPr>
-        <w:t xml:space="preserve">Exponential quantum space advantage for approximating maximum directed cut in the streaming model</w:t>
-      </w:r>
-      <w:r>
-        <w:t xml:space="preserve"> </w:t>
-      </w:r>
-      <w:r>
-        <w:t xml:space="preserve">(Proceedings of the 56th Annual ACM Symposium on Theory of Computing, STOC 2024, pp. 1805–1815, DOI 10.1145/3618260.3649709) — the first exponential quantum–classical space separation for a natural streaming problem, and the strongest peer-reviewed result of the kind the preprint extends. It is co-cited in the Related Work and in the disclosure footnote (bibliography now 55 entries; citation–bibliography consistency re-verified).</w:t>
+        <w:t xml:space="preserve">not</w:t>
+      </w:r>
+      <w:r>
+        <w:t xml:space="preserve"> </w:t>
+      </w:r>
+      <w:r>
+        <w:t xml:space="preserve">theoretically guaranteed — so if any theorem of the preprint were to change, the affected rows are identifiable at a glance.</w:t>
       </w:r>
     </w:p>
     <w:p>
@@ -880,29 +862,108 @@
           <w:b/>
           <w:bCs/>
         </w:rPr>
-        <w:t xml:space="preserve">A corrected attribution.</w:t>
-      </w:r>
-      <w:r>
-        <w:t xml:space="preserve"> </w:t>
-      </w:r>
-      <w:r>
-        <w:t xml:space="preserve">In verifying the anchors we found that our Related Work sentence credited Kallaugher’s 2021 FOCS paper with the</w:t>
-      </w:r>
-      <w:r>
-        <w:t xml:space="preserve"> </w:t>
+        <w:t xml:space="preserve">The paper’s own contribution is classical and self-standing.</w:t>
+      </w:r>
+      <w:r>
+        <w:t xml:space="preserve"> </w:t>
+      </w:r>
+      <w:r>
+        <w:t xml:space="preserve">The (τ, r) sensitivity landscape, the streaming baselines, the correlation diagnostics, and the two real-telemetry case studies are classical measurements that hold regardless of the preprint’s fate.</w:t>
+      </w:r>
+    </w:p>
+    <w:p>
+      <w:pPr>
+        <w:pStyle w:val="Compact"/>
+        <w:numPr>
+          <w:ilvl w:val="0"/>
+          <w:numId w:val="1002"/>
+        </w:numPr>
+      </w:pPr>
+      <w:r>
+        <w:rPr>
+          <w:b/>
+          <w:bCs/>
+        </w:rPr>
+        <w:t xml:space="preserve">The revision already treats the framework as a premise, not a fact.</w:t>
+      </w:r>
+      <w:r>
+        <w:t xml:space="preserve"> </w:t>
+      </w:r>
+      <w:r>
+        <w:t xml:space="preserve">Following the reviewers’ recommendations, the manuscript is repositioned as a proxy-based diagnostic and hypothesis-generation framework that stress-tests the framework’s assumptions; it states plainly that it</w:t>
+      </w:r>
+      <w:r>
+        <w:t xml:space="preserve"> </w:t>
+      </w:r>
+      <w:r>
+        <w:t xml:space="preserve">“demonstrates no quantum advantage and implements no quantum algorithm”</w:t>
+      </w:r>
+      <w:r>
+        <w:t xml:space="preserve">.</w:t>
+      </w:r>
+    </w:p>
+    <w:p>
+      <w:pPr>
+        <w:pStyle w:val="Compact"/>
+        <w:numPr>
+          <w:ilvl w:val="0"/>
+          <w:numId w:val="1002"/>
+        </w:numPr>
+      </w:pPr>
+      <w:r>
+        <w:rPr>
+          <w:b/>
+          <w:bCs/>
+        </w:rPr>
+        <w:t xml:space="preserve">Its theorems are never invoked alone.</w:t>
+      </w:r>
+      <w:r>
+        <w:t xml:space="preserve"> </w:t>
+      </w:r>
+      <w:r>
+        <w:t xml:space="preserve">Every invocation is accompanied by peer-reviewed anchors: Kallaugher (IEEE FOCS 2021, pp. 897–908), Kallaugher, Parekh and Voronova (STOC 2024, pp. 1805–1815), Kallaugher, Parekh and Voronova (SOSA 2025, pp. 9–45), and Huang et al. (</w:t>
       </w:r>
       <w:r>
         <w:rPr>
           <w:i/>
           <w:iCs/>
         </w:rPr>
-        <w:t xml:space="preserve">first exponential</w:t>
-      </w:r>
-      <w:r>
-        <w:t xml:space="preserve"> </w:t>
-      </w:r>
-      <w:r>
-        <w:t xml:space="preserve">separation; that paper’s advantage is polynomial (the exponential result for a natural streaming problem is the STOC 2024 paper above). The sentence now attributes each result correctly — a further accuracy improvement prompted directly by the Editor’s comment.</w:t>
+        <w:t xml:space="preserve">Science</w:t>
+      </w:r>
+      <w:r>
+        <w:t xml:space="preserve"> </w:t>
+      </w:r>
+      <w:r>
+        <w:rPr>
+          <w:b/>
+          <w:bCs/>
+        </w:rPr>
+        <w:t xml:space="preserve">376</w:t>
+      </w:r>
+      <w:r>
+        <w:t xml:space="preserve">, 1182–1186, 2022) — precisely the</w:t>
+      </w:r>
+      <w:r>
+        <w:t xml:space="preserve"> </w:t>
+      </w:r>
+      <w:r>
+        <w:t xml:space="preserve">“related works already published”</w:t>
+      </w:r>
+      <w:r>
+        <w:t xml:space="preserve"> </w:t>
+      </w:r>
+      <w:r>
+        <w:t xml:space="preserve">the Editor recommends, now carrying the general claims wherever they are made.</w:t>
+      </w:r>
+    </w:p>
+    <w:bookmarkEnd w:id="12"/>
+    <w:bookmarkStart w:id="13" w:name="commitment"/>
+    <w:p>
+      <w:pPr>
+        <w:pStyle w:val="Heading2"/>
+      </w:pPr>
+      <w:r>
+        <w:t xml:space="preserve">5. Commitment</w:t>
       </w:r>
     </w:p>
     <w:p>
@@ -910,49 +971,7 @@
         <w:pStyle w:val="FirstParagraph"/>
       </w:pPr>
       <w:r>
-        <w:t xml:space="preserve">At the first citation of the preprint in the Introduction we have also added a footnote making its status explicit to every reader:</w:t>
-      </w:r>
-    </w:p>
-    <w:p>
-      <w:pPr>
-        <w:pStyle w:val="BlockText"/>
-      </w:pPr>
-      <w:r>
-        <w:t xml:space="preserve">“This reference is a preprint (arXiv:2604.07639) and, at the time of writing, had not appeared in a peer-reviewed venue; it is labelled as such in the bibliography. It is cited because it is the specific framework whose robustness under correlated data this paper examines, so no already-published work can stand in for it without misattributing its results. No conclusion of this paper depends on its final published form: no quantum algorithm is implemented or simulated here, every quantity inherited from the framework is listed with its provenance and epistemic status in Table 1, and its theorems are invoked alongside peer-reviewed results on quantum streaming separations and on experimentally demonstrated quantum advantage.”</w:t>
-      </w:r>
-    </w:p>
-    <w:p>
-      <w:pPr>
-        <w:pStyle w:val="FirstParagraph"/>
-      </w:pPr>
-      <w:r>
-        <w:t xml:space="preserve">We also undertake to monitor the record and, should the work appear in a peer-reviewed venue before this manuscript reaches proofs, to replace the entry with the published version at that stage.</w:t>
-      </w:r>
-    </w:p>
-    <w:bookmarkEnd w:id="12"/>
-    <w:bookmarkStart w:id="13" w:name="if-the-editor-still-prefers-removal"/>
-    <w:p>
-      <w:pPr>
-        <w:pStyle w:val="Heading2"/>
-      </w:pPr>
-      <w:r>
-        <w:t xml:space="preserve">5. If the Editor still prefers removal</w:t>
-      </w:r>
-    </w:p>
-    <w:p>
-      <w:pPr>
-        <w:pStyle w:val="FirstParagraph"/>
-      </w:pPr>
-      <w:r>
-        <w:t xml:space="preserve">We recognise that this remains the Editor’s decision. We would only note that removing the citation entirely would require either dropping the attribution for the framework the paper analyses, or presenting its assumptions as our own — neither of which we are willing to do. If the Editor judges that the single labelled preprint is nevertheless unacceptable, we would be grateful for guidance on the preferred remedy, and we will follow it.</w:t>
-      </w:r>
-    </w:p>
-    <w:p>
-      <w:pPr>
-        <w:pStyle w:val="BodyText"/>
-      </w:pPr>
-      <w:r>
-        <w:t xml:space="preserve">We are grateful for the attention the Editor has given the reference list; the audit prompted by this comment improved the manuscript beyond the preprint question itself, and every one of the 54 references has now been verified against its publisher’s record.</w:t>
+        <w:t xml:space="preserve">We will monitor the record and, should the work appear in a peer-reviewed venue before this manuscript reaches proofs, we will replace the entry with the published version at that stage. If the Editor nevertheless judges that the single labelled preprint is unacceptable, we would be grateful for guidance on the preferred remedy and will follow it — our reservation concerns only the two remedies that would damage attribution (crediting the framework to authors who did not build it, or leaving it uncredited), not the Editor’s instruction itself, which has already improved the manuscript: the audit it prompted verified every reference against its publisher’s record, corrected one wrong article number, upgraded one citation to its published version, and strengthened the published anchors around the one reference that must remain a preprint.</w:t>
       </w:r>
     </w:p>
     <w:p>

</xml_diff>

<commit_message>
Editor letter section 1 rewritten as flowing prose (table and labelled blocks replaced by three paragraphs); packages rebuilt
</commit_message>
<xml_diff>
--- a/paper/mdpi_sensors/revision/response_to_editor.docx
+++ b/paper/mdpi_sensors/revision/response_to_editor.docx
@@ -126,296 +126,59 @@
         <w:pStyle w:val="FirstParagraph"/>
       </w:pPr>
       <w:r>
-        <w:t xml:space="preserve">Every one of the 54 references in the reviewed manuscript was classified by publication type (journal article, conference paper, monograph, book, preprint) and verified at the metadata level: all 51 entries carrying a DOI were resolved through doi.org content negotiation and machine-compared against the cited title, first author, venue, and year; the three entries without a DOI were checked against their publisher’s own record.</w:t>
-      </w:r>
-    </w:p>
-    <w:tbl>
-      <w:tblPr>
-        <w:tblStyle w:val="Table"/>
-        <w:tblW w:type="pct" w:w="5000"/>
-        <w:tblLayout w:type="fixed"/>
-        <w:tblLook w:firstRow="1" w:lastRow="0" w:firstColumn="0" w:lastColumn="0" w:noHBand="0" w:noVBand="0" w:val="0020"/>
-      </w:tblPr>
-      <w:tblGrid>
-        <w:gridCol w:w="3960"/>
-        <w:gridCol w:w="3960"/>
-      </w:tblGrid>
-      <w:tr>
-        <w:trPr>
-          <w:tblHeader w:val="on"/>
-        </w:trPr>
-        <w:tc>
-          <w:tcPr/>
-          <w:p>
-            <w:pPr>
-              <w:pStyle w:val="Compact"/>
-            </w:pPr>
-            <w:r>
-              <w:t xml:space="preserve">Outcome</w:t>
-            </w:r>
-          </w:p>
-        </w:tc>
-        <w:tc>
-          <w:tcPr/>
-          <w:p>
-            <w:pPr>
-              <w:pStyle w:val="Compact"/>
-            </w:pPr>
-            <w:r>
-              <w:t xml:space="preserve">Result</w:t>
-            </w:r>
-          </w:p>
-        </w:tc>
-      </w:tr>
-      <w:tr>
-        <w:tc>
-          <w:tcPr/>
-          <w:p>
-            <w:pPr>
-              <w:pStyle w:val="Compact"/>
-            </w:pPr>
-            <w:r>
-              <w:t xml:space="preserve">References audited</w:t>
-            </w:r>
-          </w:p>
-        </w:tc>
-        <w:tc>
-          <w:tcPr/>
-          <w:p>
-            <w:pPr>
-              <w:pStyle w:val="Compact"/>
-            </w:pPr>
-            <w:r>
-              <w:t xml:space="preserve">54</w:t>
-            </w:r>
-          </w:p>
-        </w:tc>
-      </w:tr>
-      <w:tr>
-        <w:tc>
-          <w:tcPr/>
-          <w:p>
-            <w:pPr>
-              <w:pStyle w:val="Compact"/>
-            </w:pPr>
-            <w:r>
-              <w:t xml:space="preserve">Preprints found</w:t>
-            </w:r>
-          </w:p>
-        </w:tc>
-        <w:tc>
-          <w:tcPr/>
-          <w:p>
-            <w:pPr>
-              <w:pStyle w:val="Compact"/>
-            </w:pPr>
-            <w:r>
-              <w:t xml:space="preserve">2</w:t>
-            </w:r>
-          </w:p>
-        </w:tc>
-      </w:tr>
-      <w:tr>
-        <w:tc>
-          <w:tcPr/>
-          <w:p>
-            <w:pPr>
-              <w:pStyle w:val="Compact"/>
-            </w:pPr>
-            <w:r>
-              <w:t xml:space="preserve">Replaced with the published version</w:t>
-            </w:r>
-          </w:p>
-        </w:tc>
-        <w:tc>
-          <w:tcPr/>
-          <w:p>
-            <w:pPr>
-              <w:pStyle w:val="Compact"/>
-            </w:pPr>
-            <w:r>
-              <w:t xml:space="preserve">1</w:t>
-            </w:r>
-          </w:p>
-        </w:tc>
-      </w:tr>
-      <w:tr>
-        <w:tc>
-          <w:tcPr/>
-          <w:p>
-            <w:pPr>
-              <w:pStyle w:val="Compact"/>
-            </w:pPr>
-            <w:r>
-              <w:t xml:space="preserve">Remaining preprints — no published version exists (re-verified 16 Aug 2026)</w:t>
-            </w:r>
-          </w:p>
-        </w:tc>
-        <w:tc>
-          <w:tcPr/>
-          <w:p>
-            <w:pPr>
-              <w:pStyle w:val="Compact"/>
-            </w:pPr>
-            <w:r>
-              <w:t xml:space="preserve">1</w:t>
-            </w:r>
-          </w:p>
-        </w:tc>
-      </w:tr>
-      <w:tr>
-        <w:tc>
-          <w:tcPr/>
-          <w:p>
-            <w:pPr>
-              <w:pStyle w:val="Compact"/>
-            </w:pPr>
-            <w:r>
-              <w:t xml:space="preserve">DOIs resolved and metadata-matched</w:t>
-            </w:r>
-          </w:p>
-        </w:tc>
-        <w:tc>
-          <w:tcPr/>
-          <w:p>
-            <w:pPr>
-              <w:pStyle w:val="Compact"/>
-            </w:pPr>
-            <w:r>
-              <w:t xml:space="preserve">51 / 51</w:t>
-            </w:r>
-          </w:p>
-        </w:tc>
-      </w:tr>
-      <w:tr>
-        <w:tc>
-          <w:tcPr/>
-          <w:p>
-            <w:pPr>
-              <w:pStyle w:val="Compact"/>
-            </w:pPr>
-            <w:r>
-              <w:t xml:space="preserve">Metadata errors found and corrected</w:t>
-            </w:r>
-          </w:p>
-        </w:tc>
-        <w:tc>
-          <w:tcPr/>
-          <w:p>
-            <w:pPr>
-              <w:pStyle w:val="Compact"/>
-            </w:pPr>
-            <w:r>
-              <w:t xml:space="preserve">1</w:t>
-            </w:r>
-          </w:p>
-        </w:tc>
-      </w:tr>
-      <w:tr>
-        <w:tc>
-          <w:tcPr/>
-          <w:p>
-            <w:pPr>
-              <w:pStyle w:val="Compact"/>
-            </w:pPr>
-            <w:r>
-              <w:t xml:space="preserve">In-text citations of the remaining preprint</w:t>
-            </w:r>
-          </w:p>
-        </w:tc>
-        <w:tc>
-          <w:tcPr/>
-          <w:p>
-            <w:pPr>
-              <w:pStyle w:val="Compact"/>
-            </w:pPr>
-            <w:r>
-              <w:t xml:space="preserve">reduced 8 → 6</w:t>
-            </w:r>
-          </w:p>
-        </w:tc>
-      </w:tr>
-      <w:tr>
-        <w:tc>
-          <w:tcPr/>
-          <w:p>
-            <w:pPr>
-              <w:pStyle w:val="Compact"/>
-            </w:pPr>
-            <w:r>
-              <w:t xml:space="preserve">Published anchors now co-cited with it</w:t>
-            </w:r>
-          </w:p>
-        </w:tc>
-        <w:tc>
-          <w:tcPr/>
-          <w:p>
-            <w:pPr>
-              <w:pStyle w:val="Compact"/>
-            </w:pPr>
-            <w:r>
-              <w:t xml:space="preserve">FOCS 2021 · STOC 2024 · SOSA 2025 ·</w:t>
-            </w:r>
-            <w:r>
-              <w:t xml:space="preserve"> </w:t>
-            </w:r>
-            <w:r>
-              <w:rPr>
-                <w:i/>
-                <w:iCs/>
-              </w:rPr>
-              <w:t xml:space="preserve">Science</w:t>
-            </w:r>
-            <w:r>
-              <w:t xml:space="preserve"> </w:t>
-            </w:r>
-            <w:r>
-              <w:t xml:space="preserve">2022</w:t>
-            </w:r>
-          </w:p>
-        </w:tc>
-      </w:tr>
-      <w:tr>
-        <w:tc>
-          <w:tcPr/>
-          <w:p>
-            <w:pPr>
-              <w:pStyle w:val="Compact"/>
-            </w:pPr>
-            <w:r>
-              <w:t xml:space="preserve">Bibliography after this revision</w:t>
-            </w:r>
-          </w:p>
-        </w:tc>
-        <w:tc>
-          <w:tcPr/>
-          <w:p>
-            <w:pPr>
-              <w:pStyle w:val="Compact"/>
-            </w:pPr>
-            <w:r>
-              <w:t xml:space="preserve">55 entries · citation–bibliography consistency 55 ↔ 55</w:t>
-            </w:r>
-          </w:p>
-        </w:tc>
-      </w:tr>
-    </w:tbl>
+        <w:t xml:space="preserve">Before answering the substance of the comment, we audited the reference list in full. Each of the 54 references in the reviewed manuscript was classified by publication type, and every entry was then checked against the publisher’s own metadata. For the 51 entries that carry a DOI, we resolved the DOI itself and compared the registered title, first author, venue, and year with what we cite; the three entries without a DOI were checked directly against the publisher’s records. All 51 DOIs resolved and matched. The audit found two preprints among the 54 references.</w:t>
+      </w:r>
+    </w:p>
     <w:p>
       <w:pPr>
         <w:pStyle w:val="BodyText"/>
       </w:pPr>
+      <w:r>
+        <w:t xml:space="preserve">The first of the two had in fact been published already, and we have replaced it. The Kallaugher, Parekh and Voronova paper on designing quantum streaming algorithms, previously cited through its arXiv posting, now points to its published version in the</w:t>
+      </w:r>
+      <w:r>
+        <w:t xml:space="preserve"> </w:t>
+      </w:r>
+      <w:r>
+        <w:rPr>
+          <w:i/>
+          <w:iCs/>
+        </w:rPr>
+        <w:t xml:space="preserve">Proceedings of the 2025 Symposium on Simplicity in Algorithms (SOSA)</w:t>
+      </w:r>
+      <w:r>
+        <w:t xml:space="preserve">, pp. 9–45, DOI 10.1137/1.9781611978315.2, and we confirmed the author order against the publisher’s article page and table of contents. The same sweep caught one further defect, unrelated to preprints, that would otherwise have reached print: the entry for Su, Guo and Wang (2024) carried a transposed article number whose DOI led to a different paper altogether. That entry now reads</w:t>
+      </w:r>
+      <w:r>
+        <w:t xml:space="preserve"> </w:t>
+      </w:r>
+      <w:r>
+        <w:rPr>
+          <w:i/>
+          <w:iCs/>
+        </w:rPr>
+        <w:t xml:space="preserve">Information Sciences</w:t>
+      </w:r>
+      <w:r>
+        <w:t xml:space="preserve"> </w:t>
+      </w:r>
       <w:r>
         <w:rPr>
           <w:b/>
           <w:bCs/>
         </w:rPr>
-        <w:t xml:space="preserve">Replaced.</w:t>
-      </w:r>
-      <w:r>
-        <w:t xml:space="preserve"> </w:t>
-      </w:r>
-      <w:r>
-        <w:t xml:space="preserve">Kallaugher, Parekh and Voronova,</w:t>
+        <w:t xml:space="preserve">676</w:t>
+      </w:r>
+      <w:r>
+        <w:t xml:space="preserve">, article 120799, DOI 10.1016/j.ins.2024.120799, again verified against the publisher’s record.</w:t>
+      </w:r>
+    </w:p>
+    <w:p>
+      <w:pPr>
+        <w:pStyle w:val="BodyText"/>
+      </w:pPr>
+      <w:r>
+        <w:t xml:space="preserve">The second preprint is the Zhao et al. reference discussed below. Before writing this reply we checked once more, on 16 August 2026, whether it has been published or accepted anywhere in the meantime. It has not. The arXiv record is still at version 1, with no journal reference and no related DOI. Crossref, Semantic Scholar, dblp, INSPIRE-HEP, Google Scholar and OpenReview all list the work as arXiv-only. It does not appear in the accepted-paper lists of FOCS, STOC, QIP, TQC, CCC or SODA for 2026, nor on any page of</w:t>
       </w:r>
       <w:r>
         <w:t xml:space="preserve"> </w:t>
@@ -425,10 +188,10 @@
           <w:i/>
           <w:iCs/>
         </w:rPr>
-        <w:t xml:space="preserve">How to design a quantum streaming algorithm without knowing anything about quantum computing</w:t>
-      </w:r>
-      <w:r>
-        <w:t xml:space="preserve">, previously cited via its arXiv posting, now carries its published version in the</w:t>
+        <w:t xml:space="preserve">Quantum</w:t>
+      </w:r>
+      <w:r>
+        <w:t xml:space="preserve">,</w:t>
       </w:r>
       <w:r>
         <w:t xml:space="preserve"> </w:t>
@@ -438,28 +201,10 @@
           <w:i/>
           <w:iCs/>
         </w:rPr>
-        <w:t xml:space="preserve">Proceedings of the 2025 Symposium on Simplicity in Algorithms (SOSA)</w:t>
-      </w:r>
-      <w:r>
-        <w:t xml:space="preserve">, pp. 9–45, publisher DOI 10.1137/1.9781611978315.2, with the byline order confirmed against the publisher’s article page and table of contents.</w:t>
-      </w:r>
-    </w:p>
-    <w:p>
-      <w:pPr>
-        <w:pStyle w:val="BodyText"/>
-      </w:pPr>
-      <w:r>
-        <w:rPr>
-          <w:b/>
-          <w:bCs/>
-        </w:rPr>
-        <w:t xml:space="preserve">Corrected.</w:t>
-      </w:r>
-      <w:r>
-        <w:t xml:space="preserve"> </w:t>
-      </w:r>
-      <w:r>
-        <w:t xml:space="preserve">The audit also caught a defect unrelated to preprints that would otherwise have reached print: the entry for Su, Guo and Wang (2024) carried a transposed article number whose DOI resolved to a different paper. It now reads</w:t>
+        <w:t xml:space="preserve">PRX Quantum</w:t>
+      </w:r>
+      <w:r>
+        <w:t xml:space="preserve">,</w:t>
       </w:r>
       <w:r>
         <w:t xml:space="preserve"> </w:t>
@@ -469,38 +214,10 @@
           <w:i/>
           <w:iCs/>
         </w:rPr>
-        <w:t xml:space="preserve">Information Sciences</w:t>
-      </w:r>
-      <w:r>
-        <w:t xml:space="preserve"> </w:t>
-      </w:r>
-      <w:r>
-        <w:rPr>
-          <w:b/>
-          <w:bCs/>
-        </w:rPr>
-        <w:t xml:space="preserve">676</w:t>
-      </w:r>
-      <w:r>
-        <w:t xml:space="preserve">, article 120799, DOI 10.1016/j.ins.2024.120799, verified against the publisher’s record.</w:t>
-      </w:r>
-    </w:p>
-    <w:p>
-      <w:pPr>
-        <w:pStyle w:val="BodyText"/>
-      </w:pPr>
-      <w:r>
-        <w:rPr>
-          <w:b/>
-          <w:bCs/>
-        </w:rPr>
-        <w:t xml:space="preserve">Re-verified.</w:t>
-      </w:r>
-      <w:r>
-        <w:t xml:space="preserve"> </w:t>
-      </w:r>
-      <w:r>
-        <w:t xml:space="preserve">On 16 August 2026 we checked again, specifically for this reply, whether the remaining preprint has been published or accepted anywhere. As of that date: its arXiv record remains at version 1 with no journal reference and no related DOI; Crossref, Semantic Scholar, dblp, INSPIRE-HEP, Google Scholar, and OpenReview all record the work as arXiv-only; it appears in none of the accepted-papers lists of FOCS 2026, STOC 2026, QIP 2026, TQC 2026, CCC 2026, or SODA 2026, and on no publisher page of</w:t>
+        <w:t xml:space="preserve">npj Quantum Information</w:t>
+      </w:r>
+      <w:r>
+        <w:t xml:space="preserve">,</w:t>
       </w:r>
       <w:r>
         <w:t xml:space="preserve"> </w:t>
@@ -510,10 +227,13 @@
           <w:i/>
           <w:iCs/>
         </w:rPr>
-        <w:t xml:space="preserve">Quantum</w:t>
-      </w:r>
-      <w:r>
-        <w:t xml:space="preserve">,</w:t>
+        <w:t xml:space="preserve">Nature</w:t>
+      </w:r>
+      <w:r>
+        <w:t xml:space="preserve"> </w:t>
+      </w:r>
+      <w:r>
+        <w:t xml:space="preserve">or</w:t>
       </w:r>
       <w:r>
         <w:t xml:space="preserve"> </w:t>
@@ -523,49 +243,10 @@
           <w:i/>
           <w:iCs/>
         </w:rPr>
-        <w:t xml:space="preserve">PRX Quantum</w:t>
-      </w:r>
-      <w:r>
-        <w:t xml:space="preserve">,</w:t>
-      </w:r>
-      <w:r>
-        <w:t xml:space="preserve"> </w:t>
-      </w:r>
-      <w:r>
-        <w:rPr>
-          <w:i/>
-          <w:iCs/>
-        </w:rPr>
-        <w:t xml:space="preserve">npj Quantum Information</w:t>
-      </w:r>
-      <w:r>
-        <w:t xml:space="preserve">,</w:t>
-      </w:r>
-      <w:r>
-        <w:t xml:space="preserve"> </w:t>
-      </w:r>
-      <w:r>
-        <w:rPr>
-          <w:i/>
-          <w:iCs/>
-        </w:rPr>
-        <w:t xml:space="preserve">Nature</w:t>
-      </w:r>
-      <w:r>
-        <w:t xml:space="preserve">, or</w:t>
-      </w:r>
-      <w:r>
-        <w:t xml:space="preserve"> </w:t>
-      </w:r>
-      <w:r>
-        <w:rPr>
-          <w:i/>
-          <w:iCs/>
-        </w:rPr>
         <w:t xml:space="preserve">Science</w:t>
       </w:r>
       <w:r>
-        <w:t xml:space="preserve">; the publication pages of all seven of its authors list it as arXiv-only; and none of the works citing it records a venue or an in-press status for it.</w:t>
+        <w:t xml:space="preserve">. The publication pages of all seven of its authors give only the arXiv posting, and none of the papers citing it names a venue or an in-press version. After the changes described in this reply, the bibliography contains 55 entries, of which this is the only preprint, and we have re-checked that every in-text citation matches exactly one bibliography entry.</w:t>
       </w:r>
     </w:p>
     <w:bookmarkEnd w:id="9"/>

</xml_diff>

<commit_message>
Editor letter condensed to one page (prose; all facts, both DOIs, re-verification and commitment retained); README updated; packages rebuilt (submission_R1 docx copy pending - file locked by another program)
</commit_message>
<xml_diff>
--- a/paper/mdpi_sensors/revision/response_to_editor.docx
+++ b/paper/mdpi_sensors/revision/response_to_editor.docx
@@ -2,7 +2,7 @@
 <file path=word/document.xml><?xml version="1.0" encoding="utf-8"?>
 <w:document xmlns:w="http://schemas.openxmlformats.org/wordprocessingml/2006/main" xmlns:m="http://schemas.openxmlformats.org/officeDocument/2006/math" xmlns:r="http://schemas.openxmlformats.org/officeDocument/2006/relationships" xmlns:o="urn:schemas-microsoft-com:office:office" xmlns:v="urn:schemas-microsoft-com:vml" xmlns:w10="urn:schemas-microsoft-com:office:word" xmlns:a="http://schemas.openxmlformats.org/drawingml/2006/main" xmlns:pic="http://schemas.openxmlformats.org/drawingml/2006/picture" xmlns:wp="http://schemas.openxmlformats.org/drawingml/2006/wordprocessingDrawing">
   <w:body>
-    <w:bookmarkStart w:id="14" w:name="response-to-the-academic-editor"/>
+    <w:bookmarkStart w:id="9" w:name="response-to-the-academic-editor"/>
     <w:p>
       <w:pPr>
         <w:pStyle w:val="Heading1"/>
@@ -66,15 +66,8 @@
       </w:r>
     </w:p>
     <w:p>
-      <w:r>
-        <w:pict>
-          <v:rect style="width:0;height:1.5pt" o:hralign="center" o:hrstd="t" o:hr="t"/>
-        </w:pict>
-      </w:r>
-    </w:p>
-    <w:p>
-      <w:pPr>
-        <w:pStyle w:val="FirstParagraph"/>
+      <w:pPr>
+        <w:pStyle w:val="BodyText"/>
       </w:pPr>
       <w:r>
         <w:rPr>
@@ -109,45 +102,7 @@
         <w:t xml:space="preserve"> </w:t>
       </w:r>
       <w:r>
-        <w:t xml:space="preserve">We thank the Academic Editor for this instruction and agree with the principle behind it. We acted on it in three steps. First, we audited every reference and replaced every preprint for which a published version exists. Second, immediately before submitting this revision, we re-verified that the single remaining preprint still has no published version anywhere. Third, we reduced the manuscript’s reliance on that one entry to the minimum that honest attribution permits, and strengthened the peer-reviewed anchors around it. The result: of the 55 references in the revised manuscript, exactly one is a preprint — the specific framework this paper studies — explicitly labelled as such, cited only where attributing its results requires it, and load-bearing for none of the paper’s conclusions.</w:t>
-      </w:r>
-    </w:p>
-    <w:bookmarkStart w:id="9" w:name="audit-and-re-verification"/>
-    <w:p>
-      <w:pPr>
-        <w:pStyle w:val="Heading2"/>
-      </w:pPr>
-      <w:r>
-        <w:t xml:space="preserve">1. Audit and re-verification</w:t>
-      </w:r>
-    </w:p>
-    <w:p>
-      <w:pPr>
-        <w:pStyle w:val="FirstParagraph"/>
-      </w:pPr>
-      <w:r>
-        <w:t xml:space="preserve">Before answering the substance of the comment, we audited the reference list in full. Each of the 54 references in the reviewed manuscript was classified by publication type, and every entry was then checked against the publisher’s own metadata. For the 51 entries that carry a DOI, we resolved the DOI itself and compared the registered title, first author, venue, and year with what we cite; the three entries without a DOI were checked directly against the publisher’s records. All 51 DOIs resolved and matched. The audit found two preprints among the 54 references.</w:t>
-      </w:r>
-    </w:p>
-    <w:p>
-      <w:pPr>
-        <w:pStyle w:val="BodyText"/>
-      </w:pPr>
-      <w:r>
-        <w:t xml:space="preserve">The first of the two had in fact been published already, and we have replaced it. The Kallaugher, Parekh and Voronova paper on designing quantum streaming algorithms, previously cited through its arXiv posting, now points to its published version in the</w:t>
-      </w:r>
-      <w:r>
-        <w:t xml:space="preserve"> </w:t>
-      </w:r>
-      <w:r>
-        <w:rPr>
-          <w:i/>
-          <w:iCs/>
-        </w:rPr>
-        <w:t xml:space="preserve">Proceedings of the 2025 Symposium on Simplicity in Algorithms (SOSA)</w:t>
-      </w:r>
-      <w:r>
-        <w:t xml:space="preserve">, pp. 9–45, DOI 10.1137/1.9781611978315.2, and we confirmed the author order against the publisher’s article page and table of contents. The same sweep caught one further defect, unrelated to preprints, that would otherwise have reached print: the entry for Su, Guo and Wang (2024) carried a transposed article number whose DOI led to a different paper altogether. That entry now reads</w:t>
+        <w:t xml:space="preserve">We thank the Academic Editor and agree with the principle. We audited all 54 references: every entry was checked against the publisher’s own metadata, and all 51 DOIs resolved and matched the cited title, first author, venue, and year. The audit found two preprints. One had in fact been published and has been replaced: the Kallaugher, Parekh and Voronova paper now carries its published version (SOSA 2025, pp. 9–45, DOI 10.1137/1.9781611978315.2). The same sweep also fixed a transposed article number in the Su, Guo and Wang (2024) entry, which now reads</w:t>
       </w:r>
       <w:r>
         <w:t xml:space="preserve"> </w:t>
@@ -163,14 +118,7 @@
         <w:t xml:space="preserve"> </w:t>
       </w:r>
       <w:r>
-        <w:rPr>
-          <w:b/>
-          <w:bCs/>
-        </w:rPr>
-        <w:t xml:space="preserve">676</w:t>
-      </w:r>
-      <w:r>
-        <w:t xml:space="preserve">, article 120799, DOI 10.1016/j.ins.2024.120799, again verified against the publisher’s record.</w:t>
+        <w:t xml:space="preserve">676, article 120799, DOI 10.1016/j.ins.2024.120799.</w:t>
       </w:r>
     </w:p>
     <w:p>
@@ -178,121 +126,36 @@
         <w:pStyle w:val="BodyText"/>
       </w:pPr>
       <w:r>
-        <w:t xml:space="preserve">The second preprint is the Zhao et al. reference discussed below. Before writing this reply we checked once more, on 16 August 2026, whether it has been published or accepted anywhere in the meantime. It has not. The arXiv record is still at version 1, with no journal reference and no related DOI. Crossref, Semantic Scholar, dblp, INSPIRE-HEP, Google Scholar and OpenReview all list the work as arXiv-only. It does not appear in the accepted-paper lists of FOCS, STOC, QIP, TQC, CCC or SODA for 2026, nor on any page of</w:t>
+        <w:t xml:space="preserve">One preprint remains: Zhao et al.,</w:t>
       </w:r>
       <w:r>
         <w:t xml:space="preserve"> </w:t>
       </w:r>
       <w:r>
-        <w:rPr>
-          <w:i/>
-          <w:iCs/>
-        </w:rPr>
-        <w:t xml:space="preserve">Quantum</w:t>
-      </w:r>
-      <w:r>
-        <w:t xml:space="preserve">,</w:t>
+        <w:t xml:space="preserve">“Exponential quantum advantage in processing massive classical data”</w:t>
       </w:r>
       <w:r>
         <w:t xml:space="preserve"> </w:t>
       </w:r>
       <w:r>
-        <w:rPr>
-          <w:i/>
-          <w:iCs/>
-        </w:rPr>
-        <w:t xml:space="preserve">PRX Quantum</w:t>
-      </w:r>
-      <w:r>
-        <w:t xml:space="preserve">,</w:t>
-      </w:r>
-      <w:r>
-        <w:t xml:space="preserve"> </w:t>
-      </w:r>
-      <w:r>
-        <w:rPr>
-          <w:i/>
-          <w:iCs/>
-        </w:rPr>
-        <w:t xml:space="preserve">npj Quantum Information</w:t>
-      </w:r>
-      <w:r>
-        <w:t xml:space="preserve">,</w:t>
-      </w:r>
-      <w:r>
-        <w:t xml:space="preserve"> </w:t>
-      </w:r>
-      <w:r>
-        <w:rPr>
-          <w:i/>
-          <w:iCs/>
-        </w:rPr>
-        <w:t xml:space="preserve">Nature</w:t>
-      </w:r>
-      <w:r>
-        <w:t xml:space="preserve"> </w:t>
-      </w:r>
-      <w:r>
-        <w:t xml:space="preserve">or</w:t>
-      </w:r>
-      <w:r>
-        <w:t xml:space="preserve"> </w:t>
-      </w:r>
-      <w:r>
-        <w:rPr>
-          <w:i/>
-          <w:iCs/>
-        </w:rPr>
-        <w:t xml:space="preserve">Science</w:t>
-      </w:r>
-      <w:r>
-        <w:t xml:space="preserve">. The publication pages of all seven of its authors give only the arXiv posting, and none of the papers citing it names a venue or an in-press version. After the changes described in this reply, the bibliography contains 55 entries, of which this is the only preprint, and we have re-checked that every in-text citation matches exactly one bibliography entry.</w:t>
-      </w:r>
-    </w:p>
-    <w:bookmarkEnd w:id="9"/>
-    <w:bookmarkStart w:id="10" w:name="X6d2fb164b89a225981fce3f83b4e848cdbe03fd"/>
-    <w:p>
-      <w:pPr>
-        <w:pStyle w:val="Heading2"/>
-      </w:pPr>
-      <w:r>
-        <w:t xml:space="preserve">2. The one preprint that remains — and why substitution is not available</w:t>
+        <w:t xml:space="preserve">(arXiv:2604.07639). On 16 August 2026 we re-checked whether it has been published or accepted anywhere. It has not: the arXiv record is still at version 1 with no journal reference; Crossref, Semantic Scholar, dblp, INSPIRE-HEP, Google Scholar and OpenReview list it as arXiv-only; it appears in no 2026 accepted-paper list (FOCS, STOC, QIP, TQC, CCC, SODA) and on no publisher page; and all seven authors’ publication pages give only the arXiv posting. We retain it because it is not supporting evidence for a claim of ours — it is the object of study. The paper examines how that framework’s correlation assumptions behave on non-IID streams; citing a related published work in its place would attribute its theorems to authors who did not prove them, and removing it would leave the framework the paper analyses unattributed.</w:t>
       </w:r>
     </w:p>
     <w:p>
       <w:pPr>
-        <w:pStyle w:val="FirstParagraph"/>
-      </w:pPr>
-      <w:r>
-        <w:t xml:space="preserve">The remaining entry is Zhao et al.,</w:t>
+        <w:pStyle w:val="BodyText"/>
+      </w:pPr>
+      <w:r>
+        <w:t xml:space="preserve">We have, however, reduced the manuscript’s reliance on it to the minimum honest attribution permits. Its in-text citations were cut from eight to six by consolidating two repeats. The entry is labelled</w:t>
       </w:r>
       <w:r>
         <w:t xml:space="preserve"> </w:t>
       </w:r>
       <w:r>
-        <w:rPr>
-          <w:i/>
-          <w:iCs/>
-        </w:rPr>
-        <w:t xml:space="preserve">Exponential quantum advantage in processing massive classical data</w:t>
-      </w:r>
-      <w:r>
-        <w:t xml:space="preserve"> </w:t>
-      </w:r>
-      <w:r>
-        <w:t xml:space="preserve">(arXiv:2604.07639), labelled</w:t>
-      </w:r>
-      <w:r>
-        <w:t xml:space="preserve"> </w:t>
-      </w:r>
-      <w:r>
         <w:t xml:space="preserve">“Preprint”</w:t>
       </w:r>
       <w:r>
-        <w:t xml:space="preserve"> </w:t>
-      </w:r>
-      <w:r>
-        <w:t xml:space="preserve">in the bibliography.</w:t>
+        <w:t xml:space="preserve">, and a footnote at its first citation states this status and why no conclusion depends on its final form: no quantum algorithm is implemented or simulated, and every inherited quantity is listed with its provenance and epistemic status in Table 1. We also added the strongest published anchor of its kind — Kallaugher, Parekh and Voronova (STOC 2024, pp. 1805–1815, DOI 10.1145/3618260.3649709), the first exponential quantum–classical space separation for a natural streaming problem — co-cited with it in the Related Work and in the footnote; in doing so we corrected a Related Work sentence that had credited the 2021 FOCS paper with an exponential separation (its advantage is polynomial). The bibliography now has 55 entries, and we re-checked that every in-text citation matches exactly one entry.</w:t>
       </w:r>
     </w:p>
     <w:p>
@@ -300,359 +163,7 @@
         <w:pStyle w:val="BodyText"/>
       </w:pPr>
       <w:r>
-        <w:t xml:space="preserve">We respectfully submit that this entry is a different case from the one the Editor’s instruction is aimed at. It is not cited as supporting evidence for a claim of ours, where a related published work could stand in its place.</w:t>
-      </w:r>
-      <w:r>
-        <w:t xml:space="preserve"> </w:t>
-      </w:r>
-      <w:r>
-        <w:rPr>
-          <w:b/>
-          <w:bCs/>
-        </w:rPr>
-        <w:t xml:space="preserve">It is the object of study.</w:t>
-      </w:r>
-      <w:r>
-        <w:t xml:space="preserve"> </w:t>
-      </w:r>
-      <w:r>
-        <w:t xml:space="preserve">This paper examines how the correlation assumptions of that specific framework — its refreshing time and repetition number, its ×R sample-overhead theorem, its task-specific classical hardness results — behave when the data stream is not IID. Substituting a related published work would attribute those particular theorems to authors who did not prove them; removing the citation would leave the framework the paper analyses unattributed. Either course would introduce a citation-integrity problem more serious than the one the instruction is intended to prevent.</w:t>
-      </w:r>
-    </w:p>
-    <w:p>
-      <w:pPr>
-        <w:pStyle w:val="BodyText"/>
-      </w:pPr>
-      <w:r>
-        <w:t xml:space="preserve">We did examine the closest published works in this literature as potential substitutes — including peer-reviewed results on learning quantum observables from classical data, on the circuit cost of quantum access models, and on quantum streaming advantages. None of them contains the framework studied here; where they support adjacent general claims, the manuscript already lets published references carry those claims, as described next.</w:t>
-      </w:r>
-    </w:p>
-    <w:bookmarkEnd w:id="10"/>
-    <w:bookmarkStart w:id="11" w:name="what-we-changed-in-the-manuscript"/>
-    <w:p>
-      <w:pPr>
-        <w:pStyle w:val="Heading2"/>
-      </w:pPr>
-      <w:r>
-        <w:t xml:space="preserve">3. What we changed in the manuscript</w:t>
-      </w:r>
-    </w:p>
-    <w:p>
-      <w:pPr>
-        <w:pStyle w:val="Compact"/>
-        <w:numPr>
-          <w:ilvl w:val="0"/>
-          <w:numId w:val="1001"/>
-        </w:numPr>
-      </w:pPr>
-      <w:r>
-        <w:rPr>
-          <w:b/>
-          <w:bCs/>
-        </w:rPr>
-        <w:t xml:space="preserve">In-text citations of the preprint reduced from eight to six.</w:t>
-      </w:r>
-      <w:r>
-        <w:t xml:space="preserve"> </w:t>
-      </w:r>
-      <w:r>
-        <w:t xml:space="preserve">Two repeat citations carried no independent attribution and were consolidated: a second citation within the same paragraph of Section 3.3 now reads</w:t>
-      </w:r>
-      <w:r>
-        <w:t xml:space="preserve"> </w:t>
-      </w:r>
-      <w:r>
-        <w:t xml:space="preserve">“the originating framework”</w:t>
-      </w:r>
-      <w:r>
-        <w:t xml:space="preserve">, and the quantum-memory bullet in Section 5.3 now points to Section 3.3, where the provenance is established. The preprint is now cited only at the sites where attributing its specific results requires it.</w:t>
-      </w:r>
-    </w:p>
-    <w:p>
-      <w:pPr>
-        <w:pStyle w:val="Compact"/>
-        <w:numPr>
-          <w:ilvl w:val="0"/>
-          <w:numId w:val="1001"/>
-        </w:numPr>
-      </w:pPr>
-      <w:r>
-        <w:rPr>
-          <w:b/>
-          <w:bCs/>
-        </w:rPr>
-        <w:t xml:space="preserve">A stronger published anchor added, and an attribution corrected.</w:t>
-      </w:r>
-      <w:r>
-        <w:t xml:space="preserve"> </w:t>
-      </w:r>
-      <w:r>
-        <w:t xml:space="preserve">We added Kallaugher, Parekh and Voronova,</w:t>
-      </w:r>
-      <w:r>
-        <w:t xml:space="preserve"> </w:t>
-      </w:r>
-      <w:r>
-        <w:rPr>
-          <w:i/>
-          <w:iCs/>
-        </w:rPr>
-        <w:t xml:space="preserve">Exponential quantum space advantage for approximating maximum directed cut in the streaming model</w:t>
-      </w:r>
-      <w:r>
-        <w:t xml:space="preserve"> </w:t>
-      </w:r>
-      <w:r>
-        <w:t xml:space="preserve">(Proceedings of the 56th Annual ACM Symposium on Theory of Computing, STOC 2024, pp. 1805–1815, DOI 10.1145/3618260.3649709) — the first exponential quantum–classical space separation for a natural streaming problem, and the strongest peer-reviewed result of the kind the preprint extends. It is co-cited in the Related Work and in the disclosure footnote. In verifying the anchors we also found that our Related Work sentence had credited Kallaugher’s 2021 FOCS paper with the</w:t>
-      </w:r>
-      <w:r>
-        <w:t xml:space="preserve"> </w:t>
-      </w:r>
-      <w:r>
-        <w:rPr>
-          <w:i/>
-          <w:iCs/>
-        </w:rPr>
-        <w:t xml:space="preserve">first exponential</w:t>
-      </w:r>
-      <w:r>
-        <w:t xml:space="preserve"> </w:t>
-      </w:r>
-      <w:r>
-        <w:t xml:space="preserve">separation, although that paper’s advantage is polynomial; the sentence now attributes each result correctly. The bibliography stands at 55 entries with the citation–bibliography consistency re-verified.</w:t>
-      </w:r>
-    </w:p>
-    <w:p>
-      <w:pPr>
-        <w:pStyle w:val="Compact"/>
-        <w:numPr>
-          <w:ilvl w:val="0"/>
-          <w:numId w:val="1001"/>
-        </w:numPr>
-      </w:pPr>
-      <w:r>
-        <w:rPr>
-          <w:b/>
-          <w:bCs/>
-        </w:rPr>
-        <w:t xml:space="preserve">An explicit status footnote at the first citation.</w:t>
-      </w:r>
-      <w:r>
-        <w:t xml:space="preserve"> </w:t>
-      </w:r>
-      <w:r>
-        <w:t xml:space="preserve">So that the preprint’s status is visible to every reader, the first citation in the Introduction now carries the following footnote:</w:t>
-      </w:r>
-    </w:p>
-    <w:p>
-      <w:pPr>
-        <w:pStyle w:val="BlockText"/>
-      </w:pPr>
-      <w:r>
-        <w:t xml:space="preserve">“This reference is a preprint (arXiv:2604.07639) and, at the time of writing, had not appeared in a peer-reviewed venue; it is labelled as such in the bibliography. It is cited because it is the specific framework whose robustness under correlated data this paper examines, so no already-published work can stand in for it without misattributing its results. No conclusion of this paper depends on its final published form: no quantum algorithm is implemented or simulated here, every quantity inherited from the framework is listed with its provenance and epistemic status in Table 1, and its theorems are invoked alongside peer-reviewed results on quantum streaming separations and on experimentally demonstrated quantum advantage.”</w:t>
-      </w:r>
-    </w:p>
-    <w:bookmarkEnd w:id="11"/>
-    <w:bookmarkStart w:id="12" w:name="Xaead771fc1938dab1cd9eb8763e77f2731eecee"/>
-    <w:p>
-      <w:pPr>
-        <w:pStyle w:val="Heading2"/>
-      </w:pPr>
-      <w:r>
-        <w:t xml:space="preserve">4. Why no conclusion of the paper depends on its final form</w:t>
-      </w:r>
-    </w:p>
-    <w:p>
-      <w:pPr>
-        <w:pStyle w:val="FirstParagraph"/>
-      </w:pPr>
-      <w:r>
-        <w:t xml:space="preserve">The Editor’s underlying concern is that a preprint’s content may change before publication. That risk does not propagate into this paper’s findings, for five reasons:</w:t>
-      </w:r>
-    </w:p>
-    <w:p>
-      <w:pPr>
-        <w:pStyle w:val="Compact"/>
-        <w:numPr>
-          <w:ilvl w:val="0"/>
-          <w:numId w:val="1002"/>
-        </w:numPr>
-      </w:pPr>
-      <w:r>
-        <w:rPr>
-          <w:b/>
-          <w:bCs/>
-        </w:rPr>
-        <w:t xml:space="preserve">No quantum algorithm is implemented or simulated.</w:t>
-      </w:r>
-      <w:r>
-        <w:t xml:space="preserve"> </w:t>
-      </w:r>
-      <w:r>
-        <w:t xml:space="preserve">The manuscript states this verbatim in the Abstract, Section 3.3, four results subsections, the Threats to Validity section, and the Conclusions; nothing in the paper executes or empirically confirms any result of the preprint.</w:t>
-      </w:r>
-    </w:p>
-    <w:p>
-      <w:pPr>
-        <w:pStyle w:val="Compact"/>
-        <w:numPr>
-          <w:ilvl w:val="0"/>
-          <w:numId w:val="1002"/>
-        </w:numPr>
-      </w:pPr>
-      <w:r>
-        <w:rPr>
-          <w:b/>
-          <w:bCs/>
-        </w:rPr>
-        <w:t xml:space="preserve">Every inherited quantity is tabulated with its provenance.</w:t>
-      </w:r>
-      <w:r>
-        <w:t xml:space="preserve"> </w:t>
-      </w:r>
-      <w:r>
-        <w:t xml:space="preserve">Table 1 lists, per quantity, what is inherited from the framework, what this paper introduces, and what is</w:t>
-      </w:r>
-      <w:r>
-        <w:t xml:space="preserve"> </w:t>
-      </w:r>
-      <w:r>
-        <w:rPr>
-          <w:i/>
-          <w:iCs/>
-        </w:rPr>
-        <w:t xml:space="preserve">not</w:t>
-      </w:r>
-      <w:r>
-        <w:t xml:space="preserve"> </w:t>
-      </w:r>
-      <w:r>
-        <w:t xml:space="preserve">theoretically guaranteed — so if any theorem of the preprint were to change, the affected rows are identifiable at a glance.</w:t>
-      </w:r>
-    </w:p>
-    <w:p>
-      <w:pPr>
-        <w:pStyle w:val="Compact"/>
-        <w:numPr>
-          <w:ilvl w:val="0"/>
-          <w:numId w:val="1002"/>
-        </w:numPr>
-      </w:pPr>
-      <w:r>
-        <w:rPr>
-          <w:b/>
-          <w:bCs/>
-        </w:rPr>
-        <w:t xml:space="preserve">The paper’s own contribution is classical and self-standing.</w:t>
-      </w:r>
-      <w:r>
-        <w:t xml:space="preserve"> </w:t>
-      </w:r>
-      <w:r>
-        <w:t xml:space="preserve">The (τ, r) sensitivity landscape, the streaming baselines, the correlation diagnostics, and the two real-telemetry case studies are classical measurements that hold regardless of the preprint’s fate.</w:t>
-      </w:r>
-    </w:p>
-    <w:p>
-      <w:pPr>
-        <w:pStyle w:val="Compact"/>
-        <w:numPr>
-          <w:ilvl w:val="0"/>
-          <w:numId w:val="1002"/>
-        </w:numPr>
-      </w:pPr>
-      <w:r>
-        <w:rPr>
-          <w:b/>
-          <w:bCs/>
-        </w:rPr>
-        <w:t xml:space="preserve">The revision already treats the framework as a premise, not a fact.</w:t>
-      </w:r>
-      <w:r>
-        <w:t xml:space="preserve"> </w:t>
-      </w:r>
-      <w:r>
-        <w:t xml:space="preserve">Following the reviewers’ recommendations, the manuscript is repositioned as a proxy-based diagnostic and hypothesis-generation framework that stress-tests the framework’s assumptions; it states plainly that it</w:t>
-      </w:r>
-      <w:r>
-        <w:t xml:space="preserve"> </w:t>
-      </w:r>
-      <w:r>
-        <w:t xml:space="preserve">“demonstrates no quantum advantage and implements no quantum algorithm”</w:t>
-      </w:r>
-      <w:r>
-        <w:t xml:space="preserve">.</w:t>
-      </w:r>
-    </w:p>
-    <w:p>
-      <w:pPr>
-        <w:pStyle w:val="Compact"/>
-        <w:numPr>
-          <w:ilvl w:val="0"/>
-          <w:numId w:val="1002"/>
-        </w:numPr>
-      </w:pPr>
-      <w:r>
-        <w:rPr>
-          <w:b/>
-          <w:bCs/>
-        </w:rPr>
-        <w:t xml:space="preserve">Its theorems are never invoked alone.</w:t>
-      </w:r>
-      <w:r>
-        <w:t xml:space="preserve"> </w:t>
-      </w:r>
-      <w:r>
-        <w:t xml:space="preserve">Every invocation is accompanied by peer-reviewed anchors: Kallaugher (IEEE FOCS 2021, pp. 897–908), Kallaugher, Parekh and Voronova (STOC 2024, pp. 1805–1815), Kallaugher, Parekh and Voronova (SOSA 2025, pp. 9–45), and Huang et al. (</w:t>
-      </w:r>
-      <w:r>
-        <w:rPr>
-          <w:i/>
-          <w:iCs/>
-        </w:rPr>
-        <w:t xml:space="preserve">Science</w:t>
-      </w:r>
-      <w:r>
-        <w:t xml:space="preserve"> </w:t>
-      </w:r>
-      <w:r>
-        <w:rPr>
-          <w:b/>
-          <w:bCs/>
-        </w:rPr>
-        <w:t xml:space="preserve">376</w:t>
-      </w:r>
-      <w:r>
-        <w:t xml:space="preserve">, 1182–1186, 2022) — precisely the</w:t>
-      </w:r>
-      <w:r>
-        <w:t xml:space="preserve"> </w:t>
-      </w:r>
-      <w:r>
-        <w:t xml:space="preserve">“related works already published”</w:t>
-      </w:r>
-      <w:r>
-        <w:t xml:space="preserve"> </w:t>
-      </w:r>
-      <w:r>
-        <w:t xml:space="preserve">the Editor recommends, now carrying the general claims wherever they are made.</w:t>
-      </w:r>
-    </w:p>
-    <w:bookmarkEnd w:id="12"/>
-    <w:bookmarkStart w:id="13" w:name="commitment"/>
-    <w:p>
-      <w:pPr>
-        <w:pStyle w:val="Heading2"/>
-      </w:pPr>
-      <w:r>
-        <w:t xml:space="preserve">5. Commitment</w:t>
-      </w:r>
-    </w:p>
-    <w:p>
-      <w:pPr>
-        <w:pStyle w:val="FirstParagraph"/>
-      </w:pPr>
-      <w:r>
-        <w:t xml:space="preserve">We will monitor the record and, should the work appear in a peer-reviewed venue before this manuscript reaches proofs, we will replace the entry with the published version at that stage. If the Editor nevertheless judges that the single labelled preprint is unacceptable, we would be grateful for guidance on the preferred remedy and will follow it — our reservation concerns only the two remedies that would damage attribution (crediting the framework to authors who did not build it, or leaving it uncredited), not the Editor’s instruction itself, which has already improved the manuscript: the audit it prompted verified every reference against its publisher’s record, corrected one wrong article number, upgraded one citation to its published version, and strengthened the published anchors around the one reference that must remain a preprint.</w:t>
+        <w:t xml:space="preserve">Should the work appear in a peer-reviewed venue before this manuscript reaches proofs, we will substitute the published version at that stage; and if the Editor still prefers a different remedy, we will follow the Editor’s guidance.</w:t>
       </w:r>
     </w:p>
     <w:p>
@@ -687,8 +198,7 @@
         <w:t xml:space="preserve">abdelmoniem.hafez@cu.edu.eg · ORCID 0000-0001-5996-6019</w:t>
       </w:r>
     </w:p>
-    <w:bookmarkEnd w:id="13"/>
-    <w:bookmarkEnd w:id="14"/>
+    <w:bookmarkEnd w:id="9"/>
     <w:sectPr>
       <w:footnotePr>
         <w:numRestart w:val="eachSect"/>
@@ -799,153 +309,8 @@
       </w:pPr>
     </w:lvl>
   </w:abstractNum>
-  <w:abstractNum w:abstractNumId="99411">
-    <w:nsid w:val="00A99411"/>
-    <w:multiLevelType w:val="multilevel"/>
-    <w:lvl w:ilvl="0">
-      <w:start w:val="1"/>
-      <w:numFmt w:val="decimal"/>
-      <w:lvlText w:val="%1."/>
-      <w:lvlJc w:val="left"/>
-      <w:pPr>
-        <w:ind w:left="720" w:hanging="360"/>
-      </w:pPr>
-    </w:lvl>
-    <w:lvl w:ilvl="1">
-      <w:start w:val="1"/>
-      <w:numFmt w:val="decimal"/>
-      <w:lvlText w:val="%2."/>
-      <w:lvlJc w:val="left"/>
-      <w:pPr>
-        <w:ind w:left="1440" w:hanging="360"/>
-      </w:pPr>
-    </w:lvl>
-    <w:lvl w:ilvl="2">
-      <w:start w:val="1"/>
-      <w:numFmt w:val="decimal"/>
-      <w:lvlText w:val="%3."/>
-      <w:lvlJc w:val="left"/>
-      <w:pPr>
-        <w:ind w:left="2160" w:hanging="360"/>
-      </w:pPr>
-    </w:lvl>
-    <w:lvl w:ilvl="3">
-      <w:start w:val="1"/>
-      <w:numFmt w:val="decimal"/>
-      <w:lvlText w:val="%4."/>
-      <w:lvlJc w:val="left"/>
-      <w:pPr>
-        <w:ind w:left="2880" w:hanging="360"/>
-      </w:pPr>
-    </w:lvl>
-    <w:lvl w:ilvl="4">
-      <w:start w:val="1"/>
-      <w:numFmt w:val="decimal"/>
-      <w:lvlText w:val="%5."/>
-      <w:lvlJc w:val="left"/>
-      <w:pPr>
-        <w:ind w:left="3600" w:hanging="360"/>
-      </w:pPr>
-    </w:lvl>
-    <w:lvl w:ilvl="5">
-      <w:start w:val="1"/>
-      <w:numFmt w:val="decimal"/>
-      <w:lvlText w:val="%6."/>
-      <w:lvlJc w:val="left"/>
-      <w:pPr>
-        <w:ind w:left="4320" w:hanging="360"/>
-      </w:pPr>
-    </w:lvl>
-    <w:lvl w:ilvl="6">
-      <w:start w:val="1"/>
-      <w:numFmt w:val="decimal"/>
-      <w:lvlText w:val="%7."/>
-      <w:lvlJc w:val="left"/>
-      <w:pPr>
-        <w:ind w:left="5040" w:hanging="360"/>
-      </w:pPr>
-    </w:lvl>
-    <w:lvl w:ilvl="7">
-      <w:start w:val="1"/>
-      <w:numFmt w:val="decimal"/>
-      <w:lvlText w:val="%8."/>
-      <w:lvlJc w:val="left"/>
-      <w:pPr>
-        <w:ind w:left="5760" w:hanging="360"/>
-      </w:pPr>
-    </w:lvl>
-    <w:lvl w:ilvl="8">
-      <w:start w:val="1"/>
-      <w:numFmt w:val="decimal"/>
-      <w:lvlText w:val="%9."/>
-      <w:lvlJc w:val="left"/>
-      <w:pPr>
-        <w:ind w:left="6480" w:hanging="360"/>
-      </w:pPr>
-    </w:lvl>
-  </w:abstractNum>
   <w:num w:numId="1000">
     <w:abstractNumId w:val="990"/>
-  </w:num>
-  <w:num w:numId="1001">
-    <w:abstractNumId w:val="99411"/>
-    <w:lvlOverride w:ilvl="0">
-      <w:startOverride w:val="1"/>
-    </w:lvlOverride>
-    <w:lvlOverride w:ilvl="1">
-      <w:startOverride w:val="1"/>
-    </w:lvlOverride>
-    <w:lvlOverride w:ilvl="2">
-      <w:startOverride w:val="1"/>
-    </w:lvlOverride>
-    <w:lvlOverride w:ilvl="3">
-      <w:startOverride w:val="1"/>
-    </w:lvlOverride>
-    <w:lvlOverride w:ilvl="4">
-      <w:startOverride w:val="1"/>
-    </w:lvlOverride>
-    <w:lvlOverride w:ilvl="5">
-      <w:startOverride w:val="1"/>
-    </w:lvlOverride>
-    <w:lvlOverride w:ilvl="6">
-      <w:startOverride w:val="1"/>
-    </w:lvlOverride>
-    <w:lvlOverride w:ilvl="7">
-      <w:startOverride w:val="1"/>
-    </w:lvlOverride>
-    <w:lvlOverride w:ilvl="8">
-      <w:startOverride w:val="1"/>
-    </w:lvlOverride>
-  </w:num>
-  <w:num w:numId="1002">
-    <w:abstractNumId w:val="99411"/>
-    <w:lvlOverride w:ilvl="0">
-      <w:startOverride w:val="1"/>
-    </w:lvlOverride>
-    <w:lvlOverride w:ilvl="1">
-      <w:startOverride w:val="1"/>
-    </w:lvlOverride>
-    <w:lvlOverride w:ilvl="2">
-      <w:startOverride w:val="1"/>
-    </w:lvlOverride>
-    <w:lvlOverride w:ilvl="3">
-      <w:startOverride w:val="1"/>
-    </w:lvlOverride>
-    <w:lvlOverride w:ilvl="4">
-      <w:startOverride w:val="1"/>
-    </w:lvlOverride>
-    <w:lvlOverride w:ilvl="5">
-      <w:startOverride w:val="1"/>
-    </w:lvlOverride>
-    <w:lvlOverride w:ilvl="6">
-      <w:startOverride w:val="1"/>
-    </w:lvlOverride>
-    <w:lvlOverride w:ilvl="7">
-      <w:startOverride w:val="1"/>
-    </w:lvlOverride>
-    <w:lvlOverride w:ilvl="8">
-      <w:startOverride w:val="1"/>
-    </w:lvlOverride>
   </w:num>
 </w:numbering>
 </file>

</xml_diff>

<commit_message>
Editor letter: adopt author's revision (italic journal name, bold Response label, evidentiary-support phrasing, mailto link); packages rebuilt (submission_R1 docx copy pending, file open in Word)
</commit_message>
<xml_diff>
--- a/paper/mdpi_sensors/revision/response_to_editor.docx
+++ b/paper/mdpi_sensors/revision/response_to_editor.docx
@@ -2,7 +2,7 @@
 <file path=word/document.xml><?xml version="1.0" encoding="utf-8"?>
 <w:document xmlns:w="http://schemas.openxmlformats.org/wordprocessingml/2006/main" xmlns:m="http://schemas.openxmlformats.org/officeDocument/2006/math" xmlns:r="http://schemas.openxmlformats.org/officeDocument/2006/relationships" xmlns:o="urn:schemas-microsoft-com:office:office" xmlns:v="urn:schemas-microsoft-com:vml" xmlns:w10="urn:schemas-microsoft-com:office:word" xmlns:a="http://schemas.openxmlformats.org/drawingml/2006/main" xmlns:pic="http://schemas.openxmlformats.org/drawingml/2006/picture" xmlns:wp="http://schemas.openxmlformats.org/drawingml/2006/wordprocessingDrawing">
   <w:body>
-    <w:bookmarkStart w:id="9" w:name="response-to-the-academic-editor"/>
+    <w:bookmarkStart w:id="10" w:name="response-to-the-academic-editor"/>
     <w:p>
       <w:pPr>
         <w:pStyle w:val="Heading1"/>
@@ -46,7 +46,17 @@
         <w:t xml:space="preserve"> </w:t>
       </w:r>
       <w:r>
-        <w:t xml:space="preserve">Sensors (MDPI) ·</w:t>
+        <w:rPr>
+          <w:i/>
+          <w:iCs/>
+        </w:rPr>
+        <w:t xml:space="preserve">Sensors</w:t>
+      </w:r>
+      <w:r>
+        <w:t xml:space="preserve"> </w:t>
+      </w:r>
+      <w:r>
+        <w:t xml:space="preserve">(MDPI) ·</w:t>
       </w:r>
       <w:r>
         <w:t xml:space="preserve"> </w:t>
@@ -93,8 +103,8 @@
       </w:pPr>
       <w:r>
         <w:rPr>
-          <w:i/>
-          <w:iCs/>
+          <w:b/>
+          <w:bCs/>
         </w:rPr>
         <w:t xml:space="preserve">Response.</w:t>
       </w:r>
@@ -118,7 +128,14 @@
         <w:t xml:space="preserve"> </w:t>
       </w:r>
       <w:r>
-        <w:t xml:space="preserve">676, article 120799, DOI 10.1016/j.ins.2024.120799.</w:t>
+        <w:rPr>
+          <w:b/>
+          <w:bCs/>
+        </w:rPr>
+        <w:t xml:space="preserve">676</w:t>
+      </w:r>
+      <w:r>
+        <w:t xml:space="preserve">, article 120799, DOI 10.1016/j.ins.2024.120799.</w:t>
       </w:r>
     </w:p>
     <w:p>
@@ -138,7 +155,7 @@
         <w:t xml:space="preserve"> </w:t>
       </w:r>
       <w:r>
-        <w:t xml:space="preserve">(arXiv:2604.07639). On 16 August 2026 we re-checked whether it has been published or accepted anywhere. It has not: the arXiv record is still at version 1 with no journal reference; Crossref, Semantic Scholar, dblp, INSPIRE-HEP, Google Scholar and OpenReview list it as arXiv-only; it appears in no 2026 accepted-paper list (FOCS, STOC, QIP, TQC, CCC, SODA) and on no publisher page; and all seven authors’ publication pages give only the arXiv posting. We retain it because it is not supporting evidence for a claim of ours — it is the object of study. The paper examines how that framework’s correlation assumptions behave on non-IID streams; citing a related published work in its place would attribute its theorems to authors who did not prove them, and removing it would leave the framework the paper analyses unattributed.</w:t>
+        <w:t xml:space="preserve">(arXiv:2604.07639). On 16 August 2026 we re-checked whether it has been published or accepted anywhere. It has not: the arXiv record is still at version 1 with no journal reference; Crossref, Semantic Scholar, dblp, INSPIRE-HEP, Google Scholar and OpenReview list it as arXiv-only; it appears in no 2026 accepted-paper list (FOCS, STOC, QIP, TQC, CCC, SODA) and on no publisher page; and the authors’ publication pages give only the arXiv posting. We retain it because it is not cited as evidentiary support for a claim of ours; it is the specific framework under study. The paper examines how that framework’s correlation assumptions behave on non-IID streams; citing a related published work in its place would attribute its theorems to authors who did not prove them, and removing it would leave the framework the paper analyses unattributed.</w:t>
       </w:r>
     </w:p>
     <w:p>
@@ -155,7 +172,7 @@
         <w:t xml:space="preserve">“Preprint”</w:t>
       </w:r>
       <w:r>
-        <w:t xml:space="preserve">, and a footnote at its first citation states this status and why no conclusion depends on its final form: no quantum algorithm is implemented or simulated, and every inherited quantity is listed with its provenance and epistemic status in Table 1. We also added the strongest published anchor of its kind — Kallaugher, Parekh and Voronova (STOC 2024, pp. 1805–1815, DOI 10.1145/3618260.3649709), the first exponential quantum–classical space separation for a natural streaming problem — co-cited with it in the Related Work and in the footnote; in doing so we corrected a Related Work sentence that had credited the 2021 FOCS paper with an exponential separation (its advantage is polynomial). The bibliography now has 55 entries, and we re-checked that every in-text citation matches exactly one entry.</w:t>
+        <w:t xml:space="preserve">, and a footnote at its first citation states this status and explains why the preprint is not used as evidentiary support for the paper’s empirical conclusions: no quantum algorithm is implemented or simulated, and every inherited quantity is listed with its provenance and epistemic status in Table 1. We also added the strongest published anchor of its kind — Kallaugher, Parekh and Voronova (STOC 2024, pp. 1805–1815, DOI 10.1145/3618260.3649709), the first exponential quantum–classical space separation for a natural streaming problem — co-cited with it in the Related Work and in the footnote; in doing so we corrected a Related Work sentence that had credited the 2021 FOCS paper with an exponential separation (its advantage is polynomial). The bibliography now has 55 entries, and we re-checked that every in-text citation matches exactly one entry.</w:t>
       </w:r>
     </w:p>
     <w:p>
@@ -194,11 +211,22 @@
       <w:r>
         <w:t xml:space="preserve"> </w:t>
       </w:r>
-      <w:r>
-        <w:t xml:space="preserve">abdelmoniem.hafez@cu.edu.eg · ORCID 0000-0001-5996-6019</w:t>
+      <w:hyperlink r:id="rId9">
+        <w:r>
+          <w:rPr>
+            <w:rStyle w:val="Hyperlink"/>
+          </w:rPr>
+          <w:t xml:space="preserve">abdelmoniem.hafez@cu.edu.eg</w:t>
+        </w:r>
+      </w:hyperlink>
+      <w:r>
+        <w:t xml:space="preserve"> </w:t>
+      </w:r>
+      <w:r>
+        <w:t xml:space="preserve">· ORCID 0000-0001-5996-6019</w:t>
       </w:r>
     </w:p>
-    <w:bookmarkEnd w:id="9"/>
+    <w:bookmarkEnd w:id="10"/>
     <w:sectPr>
       <w:footnotePr>
         <w:numRestart w:val="eachSect"/>

</xml_diff>

<commit_message>
Editor letter: compress re-verification enumeration to one plain sentence; offer inline-only citation (no preprint in reference list) as the remedy if the Editor insists; packages rebuilt
</commit_message>
<xml_diff>
--- a/paper/mdpi_sensors/revision/response_to_editor.docx
+++ b/paper/mdpi_sensors/revision/response_to_editor.docx
@@ -155,7 +155,7 @@
         <w:t xml:space="preserve"> </w:t>
       </w:r>
       <w:r>
-        <w:t xml:space="preserve">(arXiv:2604.07639). On 16 August 2026 we re-checked whether it has been published or accepted anywhere. It has not: the arXiv record is still at version 1 with no journal reference; Crossref, Semantic Scholar, dblp, INSPIRE-HEP, Google Scholar and OpenReview list it as arXiv-only; it appears in no 2026 accepted-paper list (FOCS, STOC, QIP, TQC, CCC, SODA) and on no publisher page; and the authors’ publication pages give only the arXiv posting. We retain it because it is not cited as evidentiary support for a claim of ours; it is the specific framework under study. The paper examines how that framework’s correlation assumptions behave on non-IID streams; citing a related published work in its place would attribute its theorems to authors who did not prove them, and removing it would leave the framework the paper analyses unattributed.</w:t>
+        <w:t xml:space="preserve">(arXiv:2604.07639). On 16 August 2026 we re-checked whether it has been published or accepted anywhere. It has not: the arXiv record is unchanged, no bibliographic database records a published or in-press version, and the authors’ own publication pages still list only the arXiv posting. We retain it because it is not cited as evidentiary support for a claim of ours; it is the specific framework under study. The paper examines how that framework’s correlation assumptions behave on non-IID streams; citing a related published work in its place would attribute its theorems to authors who did not prove them, and removing it would leave the framework the paper analyses unattributed.</w:t>
       </w:r>
     </w:p>
     <w:p>
@@ -180,7 +180,7 @@
         <w:pStyle w:val="BodyText"/>
       </w:pPr>
       <w:r>
-        <w:t xml:space="preserve">Should the work appear in a peer-reviewed venue before this manuscript reaches proofs, we will substitute the published version at that stage; and if the Editor still prefers a different remedy, we will follow the Editor’s guidance.</w:t>
+        <w:t xml:space="preserve">Should the work appear in a peer-reviewed venue before this manuscript reaches proofs, we will substitute the published version at that stage. If the Editor prefers that no preprint appear in the reference list at all, we are equally ready to move this item out of the bibliography and cite it only in the text by its arXiv identifier, so that every entry in the reference list is a published work; we did not want to take that step unilaterally, and we will follow the Editor’s guidance.</w:t>
       </w:r>
     </w:p>
     <w:p>

</xml_diff>

<commit_message>
Editor letter: adopt author's final closing (defer remedy choice to Editor, drop the named fallback; clearer FOCS-vs-STOC contrast; 55-entry explanation)
</commit_message>
<xml_diff>
--- a/paper/mdpi_sensors/revision/response_to_editor.docx
+++ b/paper/mdpi_sensors/revision/response_to_editor.docx
@@ -163,7 +163,7 @@
         <w:pStyle w:val="BodyText"/>
       </w:pPr>
       <w:r>
-        <w:t xml:space="preserve">We have, however, reduced the manuscript’s reliance on it to the minimum honest attribution permits. Its in-text citations were cut from eight to six by consolidating two repeats. The entry is labelled</w:t>
+        <w:t xml:space="preserve">We have, however, reduced the manuscript’s reliance on it to the minimum necessary for accurate attribution. Its in-text citations were cut from eight to six by consolidating two repeats. The entry is labelled</w:t>
       </w:r>
       <w:r>
         <w:t xml:space="preserve"> </w:t>
@@ -172,7 +172,7 @@
         <w:t xml:space="preserve">“Preprint”</w:t>
       </w:r>
       <w:r>
-        <w:t xml:space="preserve">, and a footnote at its first citation states this status and explains why the preprint is not used as evidentiary support for the paper’s empirical conclusions: no quantum algorithm is implemented or simulated, and every inherited quantity is listed with its provenance and epistemic status in Table 1. We also added the strongest published anchor of its kind — Kallaugher, Parekh and Voronova (STOC 2024, pp. 1805–1815, DOI 10.1145/3618260.3649709), the first exponential quantum–classical space separation for a natural streaming problem — co-cited with it in the Related Work and in the footnote; in doing so we corrected a Related Work sentence that had credited the 2021 FOCS paper with an exponential separation (its advantage is polynomial). The bibliography now has 55 entries, and we re-checked that every in-text citation matches exactly one entry.</w:t>
+        <w:t xml:space="preserve">, and a footnote at its first citation states this status and explains why the preprint is not used as evidentiary support for the paper’s empirical conclusions: no quantum algorithm is implemented or simulated, and every inherited quantity is listed with its provenance and epistemic status in Table 1. We also added the strongest published anchor of its kind — Kallaugher, Parekh and Voronova (STOC 2024, pp. 1805–1815, DOI 10.1145/3618260.3649709), the first exponential quantum–classical space separation for a natural streaming problem — co-cited with it in the Related Work and in the footnote. In doing so, we corrected a Related Work sentence that had credited the 2021 FOCS paper with an exponential separation; the FOCS 2021 result provides a polynomial quantum advantage, whereas the STOC 2024 work establishes the exponential separation. The revised bibliography now contains 55 entries, including this newly added published anchor, and we re-checked that every in-text citation matches exactly one bibliography entry.</w:t>
       </w:r>
     </w:p>
     <w:p>
@@ -180,7 +180,7 @@
         <w:pStyle w:val="BodyText"/>
       </w:pPr>
       <w:r>
-        <w:t xml:space="preserve">Should the work appear in a peer-reviewed venue before this manuscript reaches proofs, we will substitute the published version at that stage. If the Editor prefers that no preprint appear in the reference list at all, we are equally ready to move this item out of the bibliography and cite it only in the text by its arXiv identifier, so that every entry in the reference list is a published work; we did not want to take that step unilaterally, and we will follow the Editor’s guidance.</w:t>
+        <w:t xml:space="preserve">Should the work appear in a peer-reviewed venue before this manuscript reaches proofs, we will substitute the published version at that stage. If the Editor considers the presence of even this single, explicitly labelled preprint unacceptable, we would be grateful for the Editor’s preferred remedy and will follow it; we have not removed the attribution unilaterally because doing so would leave the specific framework under study without an appropriate bibliographic source.</w:t>
       </w:r>
     </w:p>
     <w:p>

</xml_diff>

<commit_message>
Editor letter: adopt author's epistemic tightening (scope the negative to records we identified; drop priority claim and self-grading superlative for the STOC 2024 anchor); propagate the same phrasing to the reviewer letters and the internal audit so no package document claims priority
</commit_message>
<xml_diff>
--- a/paper/mdpi_sensors/revision/response_to_editor.docx
+++ b/paper/mdpi_sensors/revision/response_to_editor.docx
@@ -155,7 +155,7 @@
         <w:t xml:space="preserve"> </w:t>
       </w:r>
       <w:r>
-        <w:t xml:space="preserve">(arXiv:2604.07639). On 16 August 2026 we re-checked whether it has been published or accepted anywhere. It has not: the arXiv record is unchanged, no bibliographic database records a published or in-press version, and the authors’ own publication pages still list only the arXiv posting. We retain it because it is not cited as evidentiary support for a claim of ours; it is the specific framework under study. The paper examines how that framework’s correlation assumptions behave on non-IID streams; citing a related published work in its place would attribute its theorems to authors who did not prove them, and removing it would leave the framework the paper analyses unattributed.</w:t>
+        <w:t xml:space="preserve">(arXiv:2604.07639). On 16 August 2026 we re-checked whether it has been published or accepted anywhere. It has not: the arXiv record is unchanged, no bibliographic record we identified indicates a published or in-press version, and the authors’ own publication pages still list only the arXiv posting. We retain it because it is not cited as evidentiary support for a claim of ours; it is the specific framework under study. The paper examines how that framework’s correlation assumptions behave on non-IID streams; citing a related published work in its place would attribute its theorems to authors who did not prove them, and removing it would leave the framework the paper analyses unattributed.</w:t>
       </w:r>
     </w:p>
     <w:p>
@@ -172,7 +172,7 @@
         <w:t xml:space="preserve">“Preprint”</w:t>
       </w:r>
       <w:r>
-        <w:t xml:space="preserve">, and a footnote at its first citation states this status and explains why the preprint is not used as evidentiary support for the paper’s empirical conclusions: no quantum algorithm is implemented or simulated, and every inherited quantity is listed with its provenance and epistemic status in Table 1. We also added the strongest published anchor of its kind — Kallaugher, Parekh and Voronova (STOC 2024, pp. 1805–1815, DOI 10.1145/3618260.3649709), the first exponential quantum–classical space separation for a natural streaming problem — co-cited with it in the Related Work and in the footnote. In doing so, we corrected a Related Work sentence that had credited the 2021 FOCS paper with an exponential separation; the FOCS 2021 result provides a polynomial quantum advantage, whereas the STOC 2024 work establishes the exponential separation. The revised bibliography now contains 55 entries, including this newly added published anchor, and we re-checked that every in-text citation matches exactly one bibliography entry.</w:t>
+        <w:t xml:space="preserve">, and a footnote at its first citation states this status and explains why the preprint is not used as evidentiary support for the paper’s empirical conclusions: no quantum algorithm is implemented or simulated, and every inherited quantity is listed with its provenance and epistemic status in Table 1. We also added a strong peer-reviewed published anchor of the same general kind — Kallaugher, Parekh and Voronova (STOC 2024, pp. 1805–1815, DOI 10.1145/3618260.3649709), which establishes an exponential quantum–classical space separation for a natural streaming problem — co-cited with it in the Related Work and in the footnote. In doing so, we corrected a Related Work sentence that had credited the 2021 FOCS paper with an exponential separation; the FOCS 2021 result provides a polynomial quantum advantage, whereas the STOC 2024 work establishes the exponential separation. The revised bibliography now contains 55 entries, including this newly added published anchor, and we re-checked that every in-text citation matches exactly one bibliography entry.</w:t>
       </w:r>
     </w:p>
     <w:p>

</xml_diff>